<commit_message>
Add Frontend Software Implementation
</commit_message>
<xml_diff>
--- a/document/diploma.docx
+++ b/document/diploma.docx
@@ -516,7 +516,7 @@
         </w:p>
         <w:p>
           <w:pPr>
-            <w:pStyle w:val="14"/>
+            <w:pStyle w:val="15"/>
             <w:tabs>
               <w:tab w:val="right" w:leader="dot" w:pos="9071"/>
             </w:tabs>
@@ -560,51 +560,6 @@
           </w:r>
           <w:r>
             <w:t>4</w:t>
-          </w:r>
-          <w:r>
-            <w:fldChar w:fldCharType="end"/>
-          </w:r>
-          <w:r>
-            <w:fldChar w:fldCharType="end"/>
-          </w:r>
-        </w:p>
-        <w:p>
-          <w:pPr>
-            <w:pStyle w:val="14"/>
-            <w:tabs>
-              <w:tab w:val="right" w:leader="dot" w:pos="9071"/>
-            </w:tabs>
-          </w:pPr>
-          <w:r>
-            <w:fldChar w:fldCharType="begin"/>
-          </w:r>
-          <w:r>
-            <w:instrText xml:space="preserve"> HYPERLINK \l _Toc17518 </w:instrText>
-          </w:r>
-          <w:r>
-            <w:fldChar w:fldCharType="separate"/>
-          </w:r>
-          <w:r>
-            <w:rPr>
-              <w:rFonts w:hint="default"/>
-              <w:lang w:val="en-US"/>
-            </w:rPr>
-            <w:t>Ⅱ. PROBLEM DOMAIN AND LITERATURE REVIEW</w:t>
-          </w:r>
-          <w:r>
-            <w:tab/>
-          </w:r>
-          <w:r>
-            <w:fldChar w:fldCharType="begin"/>
-          </w:r>
-          <w:r>
-            <w:instrText xml:space="preserve"> PAGEREF _Toc17518 \h </w:instrText>
-          </w:r>
-          <w:r>
-            <w:fldChar w:fldCharType="separate"/>
-          </w:r>
-          <w:r>
-            <w:t>6</w:t>
           </w:r>
           <w:r>
             <w:fldChar w:fldCharType="end"/>
@@ -624,6 +579,51 @@
             <w:fldChar w:fldCharType="begin"/>
           </w:r>
           <w:r>
+            <w:instrText xml:space="preserve"> HYPERLINK \l _Toc17518 </w:instrText>
+          </w:r>
+          <w:r>
+            <w:fldChar w:fldCharType="separate"/>
+          </w:r>
+          <w:r>
+            <w:rPr>
+              <w:rFonts w:hint="default"/>
+              <w:lang w:val="en-US"/>
+            </w:rPr>
+            <w:t>Ⅱ. PROBLEM DOMAIN AND LITERATURE REVIEW</w:t>
+          </w:r>
+          <w:r>
+            <w:tab/>
+          </w:r>
+          <w:r>
+            <w:fldChar w:fldCharType="begin"/>
+          </w:r>
+          <w:r>
+            <w:instrText xml:space="preserve"> PAGEREF _Toc17518 \h </w:instrText>
+          </w:r>
+          <w:r>
+            <w:fldChar w:fldCharType="separate"/>
+          </w:r>
+          <w:r>
+            <w:t>6</w:t>
+          </w:r>
+          <w:r>
+            <w:fldChar w:fldCharType="end"/>
+          </w:r>
+          <w:r>
+            <w:fldChar w:fldCharType="end"/>
+          </w:r>
+        </w:p>
+        <w:p>
+          <w:pPr>
+            <w:pStyle w:val="16"/>
+            <w:tabs>
+              <w:tab w:val="right" w:leader="dot" w:pos="9071"/>
+            </w:tabs>
+          </w:pPr>
+          <w:r>
+            <w:fldChar w:fldCharType="begin"/>
+          </w:r>
+          <w:r>
             <w:instrText xml:space="preserve"> HYPERLINK \l _Toc27778 </w:instrText>
           </w:r>
           <w:r>
@@ -650,6 +650,411 @@
           </w:r>
           <w:r>
             <w:t>6</w:t>
+          </w:r>
+          <w:r>
+            <w:fldChar w:fldCharType="end"/>
+          </w:r>
+          <w:r>
+            <w:fldChar w:fldCharType="end"/>
+          </w:r>
+        </w:p>
+        <w:p>
+          <w:pPr>
+            <w:pStyle w:val="16"/>
+            <w:tabs>
+              <w:tab w:val="right" w:leader="dot" w:pos="9071"/>
+            </w:tabs>
+          </w:pPr>
+          <w:r>
+            <w:fldChar w:fldCharType="begin"/>
+          </w:r>
+          <w:r>
+            <w:instrText xml:space="preserve"> HYPERLINK \l _Toc30187 </w:instrText>
+          </w:r>
+          <w:r>
+            <w:fldChar w:fldCharType="separate"/>
+          </w:r>
+          <w:r>
+            <w:rPr>
+              <w:rFonts w:hint="default"/>
+              <w:lang w:val="en-US"/>
+            </w:rPr>
+            <w:t>THEORY BEHIND NEURAL NETWORKS</w:t>
+          </w:r>
+          <w:r>
+            <w:tab/>
+          </w:r>
+          <w:r>
+            <w:fldChar w:fldCharType="begin"/>
+          </w:r>
+          <w:r>
+            <w:instrText xml:space="preserve"> PAGEREF _Toc30187 \h </w:instrText>
+          </w:r>
+          <w:r>
+            <w:fldChar w:fldCharType="separate"/>
+          </w:r>
+          <w:r>
+            <w:t>8</w:t>
+          </w:r>
+          <w:r>
+            <w:fldChar w:fldCharType="end"/>
+          </w:r>
+          <w:r>
+            <w:fldChar w:fldCharType="end"/>
+          </w:r>
+        </w:p>
+        <w:p>
+          <w:pPr>
+            <w:pStyle w:val="17"/>
+            <w:tabs>
+              <w:tab w:val="right" w:leader="dot" w:pos="9071"/>
+            </w:tabs>
+          </w:pPr>
+          <w:r>
+            <w:fldChar w:fldCharType="begin"/>
+          </w:r>
+          <w:r>
+            <w:instrText xml:space="preserve"> HYPERLINK \l _Toc22453 </w:instrText>
+          </w:r>
+          <w:r>
+            <w:fldChar w:fldCharType="separate"/>
+          </w:r>
+          <w:r>
+            <w:rPr>
+              <w:rFonts w:hint="default"/>
+              <w:lang w:val="en-US"/>
+            </w:rPr>
+            <w:t>GENERAL ARCHITECTURE OF CNN</w:t>
+          </w:r>
+          <w:r>
+            <w:tab/>
+          </w:r>
+          <w:r>
+            <w:fldChar w:fldCharType="begin"/>
+          </w:r>
+          <w:r>
+            <w:instrText xml:space="preserve"> PAGEREF _Toc22453 \h </w:instrText>
+          </w:r>
+          <w:r>
+            <w:fldChar w:fldCharType="separate"/>
+          </w:r>
+          <w:r>
+            <w:t>8</w:t>
+          </w:r>
+          <w:r>
+            <w:fldChar w:fldCharType="end"/>
+          </w:r>
+          <w:r>
+            <w:fldChar w:fldCharType="end"/>
+          </w:r>
+        </w:p>
+        <w:p>
+          <w:pPr>
+            <w:pStyle w:val="17"/>
+            <w:tabs>
+              <w:tab w:val="right" w:leader="dot" w:pos="9071"/>
+            </w:tabs>
+          </w:pPr>
+          <w:r>
+            <w:fldChar w:fldCharType="begin"/>
+          </w:r>
+          <w:r>
+            <w:instrText xml:space="preserve"> HYPERLINK \l _Toc28539 </w:instrText>
+          </w:r>
+          <w:r>
+            <w:fldChar w:fldCharType="separate"/>
+          </w:r>
+          <w:r>
+            <w:rPr>
+              <w:rFonts w:hint="default"/>
+              <w:lang w:val="en-US"/>
+            </w:rPr>
+            <w:t>TRANSFER LEARNING</w:t>
+          </w:r>
+          <w:r>
+            <w:tab/>
+          </w:r>
+          <w:r>
+            <w:fldChar w:fldCharType="begin"/>
+          </w:r>
+          <w:r>
+            <w:instrText xml:space="preserve"> PAGEREF _Toc28539 \h </w:instrText>
+          </w:r>
+          <w:r>
+            <w:fldChar w:fldCharType="separate"/>
+          </w:r>
+          <w:r>
+            <w:t>10</w:t>
+          </w:r>
+          <w:r>
+            <w:fldChar w:fldCharType="end"/>
+          </w:r>
+          <w:r>
+            <w:fldChar w:fldCharType="end"/>
+          </w:r>
+        </w:p>
+        <w:p>
+          <w:pPr>
+            <w:pStyle w:val="16"/>
+            <w:tabs>
+              <w:tab w:val="right" w:leader="dot" w:pos="9071"/>
+            </w:tabs>
+          </w:pPr>
+          <w:r>
+            <w:fldChar w:fldCharType="begin"/>
+          </w:r>
+          <w:r>
+            <w:instrText xml:space="preserve"> HYPERLINK \l _Toc2861 </w:instrText>
+          </w:r>
+          <w:r>
+            <w:fldChar w:fldCharType="separate"/>
+          </w:r>
+          <w:r>
+            <w:rPr>
+              <w:rFonts w:hint="default"/>
+              <w:lang w:val="en-US"/>
+            </w:rPr>
+            <w:t>PLANT DISEASE DATASETS</w:t>
+          </w:r>
+          <w:r>
+            <w:tab/>
+          </w:r>
+          <w:r>
+            <w:fldChar w:fldCharType="begin"/>
+          </w:r>
+          <w:r>
+            <w:instrText xml:space="preserve"> PAGEREF _Toc2861 \h </w:instrText>
+          </w:r>
+          <w:r>
+            <w:fldChar w:fldCharType="separate"/>
+          </w:r>
+          <w:r>
+            <w:t>12</w:t>
+          </w:r>
+          <w:r>
+            <w:fldChar w:fldCharType="end"/>
+          </w:r>
+          <w:r>
+            <w:fldChar w:fldCharType="end"/>
+          </w:r>
+        </w:p>
+        <w:p>
+          <w:pPr>
+            <w:pStyle w:val="17"/>
+            <w:tabs>
+              <w:tab w:val="right" w:leader="dot" w:pos="9071"/>
+            </w:tabs>
+          </w:pPr>
+          <w:r>
+            <w:fldChar w:fldCharType="begin"/>
+          </w:r>
+          <w:r>
+            <w:instrText xml:space="preserve"> HYPERLINK \l _Toc32698 </w:instrText>
+          </w:r>
+          <w:r>
+            <w:fldChar w:fldCharType="separate"/>
+          </w:r>
+          <w:r>
+            <w:rPr>
+              <w:rFonts w:hint="default"/>
+              <w:lang w:val="en-US"/>
+            </w:rPr>
+            <w:t>PLANTVILLAGE</w:t>
+          </w:r>
+          <w:r>
+            <w:tab/>
+          </w:r>
+          <w:r>
+            <w:fldChar w:fldCharType="begin"/>
+          </w:r>
+          <w:r>
+            <w:instrText xml:space="preserve"> PAGEREF _Toc32698 \h </w:instrText>
+          </w:r>
+          <w:r>
+            <w:fldChar w:fldCharType="separate"/>
+          </w:r>
+          <w:r>
+            <w:t>12</w:t>
+          </w:r>
+          <w:r>
+            <w:fldChar w:fldCharType="end"/>
+          </w:r>
+          <w:r>
+            <w:fldChar w:fldCharType="end"/>
+          </w:r>
+        </w:p>
+        <w:p>
+          <w:pPr>
+            <w:pStyle w:val="17"/>
+            <w:tabs>
+              <w:tab w:val="right" w:leader="dot" w:pos="9071"/>
+            </w:tabs>
+          </w:pPr>
+          <w:r>
+            <w:fldChar w:fldCharType="begin"/>
+          </w:r>
+          <w:r>
+            <w:instrText xml:space="preserve"> HYPERLINK \l _Toc14617 </w:instrText>
+          </w:r>
+          <w:r>
+            <w:fldChar w:fldCharType="separate"/>
+          </w:r>
+          <w:r>
+            <w:rPr>
+              <w:rFonts w:hint="default"/>
+              <w:lang w:val="en-US"/>
+            </w:rPr>
+            <w:t>PLANTDOC</w:t>
+          </w:r>
+          <w:r>
+            <w:tab/>
+          </w:r>
+          <w:r>
+            <w:fldChar w:fldCharType="begin"/>
+          </w:r>
+          <w:r>
+            <w:instrText xml:space="preserve"> PAGEREF _Toc14617 \h </w:instrText>
+          </w:r>
+          <w:r>
+            <w:fldChar w:fldCharType="separate"/>
+          </w:r>
+          <w:r>
+            <w:t>13</w:t>
+          </w:r>
+          <w:r>
+            <w:fldChar w:fldCharType="end"/>
+          </w:r>
+          <w:r>
+            <w:fldChar w:fldCharType="end"/>
+          </w:r>
+        </w:p>
+        <w:p>
+          <w:pPr>
+            <w:pStyle w:val="16"/>
+            <w:tabs>
+              <w:tab w:val="right" w:leader="dot" w:pos="9071"/>
+            </w:tabs>
+          </w:pPr>
+          <w:r>
+            <w:fldChar w:fldCharType="begin"/>
+          </w:r>
+          <w:r>
+            <w:instrText xml:space="preserve"> HYPERLINK \l _Toc15893 </w:instrText>
+          </w:r>
+          <w:r>
+            <w:fldChar w:fldCharType="separate"/>
+          </w:r>
+          <w:r>
+            <w:rPr>
+              <w:rFonts w:hint="default"/>
+              <w:lang w:val="en-US"/>
+            </w:rPr>
+            <w:t>EXISTING PLANT DISEASE CLASSIFICATION MODELS</w:t>
+          </w:r>
+          <w:r>
+            <w:tab/>
+          </w:r>
+          <w:r>
+            <w:fldChar w:fldCharType="begin"/>
+          </w:r>
+          <w:r>
+            <w:instrText xml:space="preserve"> PAGEREF _Toc15893 \h </w:instrText>
+          </w:r>
+          <w:r>
+            <w:fldChar w:fldCharType="separate"/>
+          </w:r>
+          <w:r>
+            <w:t>14</w:t>
+          </w:r>
+          <w:r>
+            <w:fldChar w:fldCharType="end"/>
+          </w:r>
+          <w:r>
+            <w:fldChar w:fldCharType="end"/>
+          </w:r>
+        </w:p>
+        <w:p>
+          <w:pPr>
+            <w:pStyle w:val="17"/>
+            <w:tabs>
+              <w:tab w:val="right" w:leader="dot" w:pos="9071"/>
+            </w:tabs>
+          </w:pPr>
+          <w:r>
+            <w:fldChar w:fldCharType="begin"/>
+          </w:r>
+          <w:r>
+            <w:instrText xml:space="preserve"> HYPERLINK \l _Toc31047 </w:instrText>
+          </w:r>
+          <w:r>
+            <w:fldChar w:fldCharType="separate"/>
+          </w:r>
+          <w:r>
+            <w:rPr>
+              <w:rFonts w:hint="default"/>
+              <w:lang w:val="en-US"/>
+            </w:rPr>
+            <w:t>MOHANTY ET AL. [6]</w:t>
+          </w:r>
+          <w:r>
+            <w:tab/>
+          </w:r>
+          <w:r>
+            <w:fldChar w:fldCharType="begin"/>
+          </w:r>
+          <w:r>
+            <w:instrText xml:space="preserve"> PAGEREF _Toc31047 \h </w:instrText>
+          </w:r>
+          <w:r>
+            <w:fldChar w:fldCharType="separate"/>
+          </w:r>
+          <w:r>
+            <w:t>14</w:t>
+          </w:r>
+          <w:r>
+            <w:fldChar w:fldCharType="end"/>
+          </w:r>
+          <w:r>
+            <w:fldChar w:fldCharType="end"/>
+          </w:r>
+        </w:p>
+        <w:p>
+          <w:pPr>
+            <w:pStyle w:val="17"/>
+            <w:tabs>
+              <w:tab w:val="right" w:leader="dot" w:pos="9071"/>
+            </w:tabs>
+          </w:pPr>
+          <w:r>
+            <w:fldChar w:fldCharType="begin"/>
+          </w:r>
+          <w:r>
+            <w:instrText xml:space="preserve"> HYPERLINK \l _Toc4335 </w:instrText>
+          </w:r>
+          <w:r>
+            <w:fldChar w:fldCharType="separate"/>
+          </w:r>
+          <w:r>
+            <w:rPr>
+              <w:rFonts w:hint="default"/>
+              <w:lang w:val="en-US"/>
+            </w:rPr>
+            <w:t>SALMAN ET AL. [1]</w:t>
+          </w:r>
+          <w:r>
+            <w:tab/>
+          </w:r>
+          <w:r>
+            <w:fldChar w:fldCharType="begin"/>
+          </w:r>
+          <w:r>
+            <w:instrText xml:space="preserve"> PAGEREF _Toc4335 \h </w:instrText>
+          </w:r>
+          <w:r>
+            <w:fldChar w:fldCharType="separate"/>
+          </w:r>
+          <w:r>
+            <w:t>15</w:t>
           </w:r>
           <w:r>
             <w:fldChar w:fldCharType="end"/>
@@ -669,7 +1074,7 @@
             <w:fldChar w:fldCharType="begin"/>
           </w:r>
           <w:r>
-            <w:instrText xml:space="preserve"> HYPERLINK \l _Toc30187 </w:instrText>
+            <w:instrText xml:space="preserve"> HYPERLINK \l _Toc14127 </w:instrText>
           </w:r>
           <w:r>
             <w:fldChar w:fldCharType="separate"/>
@@ -679,7 +1084,7 @@
               <w:rFonts w:hint="default"/>
               <w:lang w:val="en-US"/>
             </w:rPr>
-            <w:t>THEORY BEHIND NEURAL NETWORKS</w:t>
+            <w:t>Ⅲ. SYSTEM DESIGN</w:t>
           </w:r>
           <w:r>
             <w:tab/>
@@ -688,13 +1093,13 @@
             <w:fldChar w:fldCharType="begin"/>
           </w:r>
           <w:r>
-            <w:instrText xml:space="preserve"> PAGEREF _Toc30187 \h </w:instrText>
+            <w:instrText xml:space="preserve"> PAGEREF _Toc14127 \h </w:instrText>
           </w:r>
           <w:r>
             <w:fldChar w:fldCharType="separate"/>
           </w:r>
           <w:r>
-            <w:t>8</w:t>
+            <w:t>17</w:t>
           </w:r>
           <w:r>
             <w:fldChar w:fldCharType="end"/>
@@ -714,7 +1119,7 @@
             <w:fldChar w:fldCharType="begin"/>
           </w:r>
           <w:r>
-            <w:instrText xml:space="preserve"> HYPERLINK \l _Toc22453 </w:instrText>
+            <w:instrText xml:space="preserve"> HYPERLINK \l _Toc25081 </w:instrText>
           </w:r>
           <w:r>
             <w:fldChar w:fldCharType="separate"/>
@@ -724,7 +1129,7 @@
               <w:rFonts w:hint="default"/>
               <w:lang w:val="en-US"/>
             </w:rPr>
-            <w:t>GENERAL ARCHITECTURE OF CNN</w:t>
+            <w:t>GOALS AND OBJECTIVES</w:t>
           </w:r>
           <w:r>
             <w:tab/>
@@ -733,13 +1138,13 @@
             <w:fldChar w:fldCharType="begin"/>
           </w:r>
           <w:r>
-            <w:instrText xml:space="preserve"> PAGEREF _Toc22453 \h </w:instrText>
+            <w:instrText xml:space="preserve"> PAGEREF _Toc25081 \h </w:instrText>
           </w:r>
           <w:r>
             <w:fldChar w:fldCharType="separate"/>
           </w:r>
           <w:r>
-            <w:t>8</w:t>
+            <w:t>17</w:t>
           </w:r>
           <w:r>
             <w:fldChar w:fldCharType="end"/>
@@ -759,7 +1164,7 @@
             <w:fldChar w:fldCharType="begin"/>
           </w:r>
           <w:r>
-            <w:instrText xml:space="preserve"> HYPERLINK \l _Toc28539 </w:instrText>
+            <w:instrText xml:space="preserve"> HYPERLINK \l _Toc6510 </w:instrText>
           </w:r>
           <w:r>
             <w:fldChar w:fldCharType="separate"/>
@@ -769,7 +1174,7 @@
               <w:rFonts w:hint="default"/>
               <w:lang w:val="en-US"/>
             </w:rPr>
-            <w:t>TRANSFER LEARNING</w:t>
+            <w:t>WEB MODULE</w:t>
           </w:r>
           <w:r>
             <w:tab/>
@@ -778,13 +1183,13 @@
             <w:fldChar w:fldCharType="begin"/>
           </w:r>
           <w:r>
-            <w:instrText xml:space="preserve"> PAGEREF _Toc28539 \h </w:instrText>
+            <w:instrText xml:space="preserve"> PAGEREF _Toc6510 \h </w:instrText>
           </w:r>
           <w:r>
             <w:fldChar w:fldCharType="separate"/>
           </w:r>
           <w:r>
-            <w:t>10</w:t>
+            <w:t>18</w:t>
           </w:r>
           <w:r>
             <w:fldChar w:fldCharType="end"/>
@@ -795,7 +1200,7 @@
         </w:p>
         <w:p>
           <w:pPr>
-            <w:pStyle w:val="15"/>
+            <w:pStyle w:val="17"/>
             <w:tabs>
               <w:tab w:val="right" w:leader="dot" w:pos="9071"/>
             </w:tabs>
@@ -804,7 +1209,7 @@
             <w:fldChar w:fldCharType="begin"/>
           </w:r>
           <w:r>
-            <w:instrText xml:space="preserve"> HYPERLINK \l _Toc2861 </w:instrText>
+            <w:instrText xml:space="preserve"> HYPERLINK \l _Toc23106 </w:instrText>
           </w:r>
           <w:r>
             <w:fldChar w:fldCharType="separate"/>
@@ -814,7 +1219,7 @@
               <w:rFonts w:hint="default"/>
               <w:lang w:val="en-US"/>
             </w:rPr>
-            <w:t>PLANT DISEASE DATASETS</w:t>
+            <w:t>SYSTEM FUNCTIONS</w:t>
           </w:r>
           <w:r>
             <w:tab/>
@@ -823,13 +1228,148 @@
             <w:fldChar w:fldCharType="begin"/>
           </w:r>
           <w:r>
-            <w:instrText xml:space="preserve"> PAGEREF _Toc2861 \h </w:instrText>
+            <w:instrText xml:space="preserve"> PAGEREF _Toc23106 \h </w:instrText>
           </w:r>
           <w:r>
             <w:fldChar w:fldCharType="separate"/>
           </w:r>
           <w:r>
-            <w:t>12</w:t>
+            <w:t>18</w:t>
+          </w:r>
+          <w:r>
+            <w:fldChar w:fldCharType="end"/>
+          </w:r>
+          <w:r>
+            <w:fldChar w:fldCharType="end"/>
+          </w:r>
+        </w:p>
+        <w:p>
+          <w:pPr>
+            <w:pStyle w:val="17"/>
+            <w:tabs>
+              <w:tab w:val="right" w:leader="dot" w:pos="9071"/>
+            </w:tabs>
+          </w:pPr>
+          <w:r>
+            <w:fldChar w:fldCharType="begin"/>
+          </w:r>
+          <w:r>
+            <w:instrText xml:space="preserve"> HYPERLINK \l _Toc30234 </w:instrText>
+          </w:r>
+          <w:r>
+            <w:fldChar w:fldCharType="separate"/>
+          </w:r>
+          <w:r>
+            <w:rPr>
+              <w:rFonts w:hint="default"/>
+              <w:lang w:val="en-US"/>
+            </w:rPr>
+            <w:t>SYNTHESIS OF STRUCTURE - FRONTEND</w:t>
+          </w:r>
+          <w:r>
+            <w:tab/>
+          </w:r>
+          <w:r>
+            <w:fldChar w:fldCharType="begin"/>
+          </w:r>
+          <w:r>
+            <w:instrText xml:space="preserve"> PAGEREF _Toc30234 \h </w:instrText>
+          </w:r>
+          <w:r>
+            <w:fldChar w:fldCharType="separate"/>
+          </w:r>
+          <w:r>
+            <w:t>19</w:t>
+          </w:r>
+          <w:r>
+            <w:fldChar w:fldCharType="end"/>
+          </w:r>
+          <w:r>
+            <w:fldChar w:fldCharType="end"/>
+          </w:r>
+        </w:p>
+        <w:p>
+          <w:pPr>
+            <w:pStyle w:val="17"/>
+            <w:tabs>
+              <w:tab w:val="right" w:leader="dot" w:pos="9071"/>
+            </w:tabs>
+          </w:pPr>
+          <w:r>
+            <w:fldChar w:fldCharType="begin"/>
+          </w:r>
+          <w:r>
+            <w:instrText xml:space="preserve"> HYPERLINK \l _Toc3018 </w:instrText>
+          </w:r>
+          <w:r>
+            <w:fldChar w:fldCharType="separate"/>
+          </w:r>
+          <w:r>
+            <w:rPr>
+              <w:rFonts w:hint="default"/>
+              <w:lang w:val="en-US"/>
+            </w:rPr>
+            <w:t>SYNTHESIS OF STRUCTURE - BACKEND</w:t>
+          </w:r>
+          <w:r>
+            <w:tab/>
+          </w:r>
+          <w:r>
+            <w:fldChar w:fldCharType="begin"/>
+          </w:r>
+          <w:r>
+            <w:instrText xml:space="preserve"> PAGEREF _Toc3018 \h </w:instrText>
+          </w:r>
+          <w:r>
+            <w:fldChar w:fldCharType="separate"/>
+          </w:r>
+          <w:r>
+            <w:t>21</w:t>
+          </w:r>
+          <w:r>
+            <w:fldChar w:fldCharType="end"/>
+          </w:r>
+          <w:r>
+            <w:fldChar w:fldCharType="end"/>
+          </w:r>
+        </w:p>
+        <w:p>
+          <w:pPr>
+            <w:pStyle w:val="17"/>
+            <w:tabs>
+              <w:tab w:val="right" w:leader="dot" w:pos="9071"/>
+            </w:tabs>
+          </w:pPr>
+          <w:r>
+            <w:fldChar w:fldCharType="begin"/>
+          </w:r>
+          <w:r>
+            <w:instrText xml:space="preserve"> HYPERLINK \l _Toc17030 </w:instrText>
+          </w:r>
+          <w:r>
+            <w:fldChar w:fldCharType="separate"/>
+          </w:r>
+          <w:r>
+            <w:rPr>
+              <w:rFonts w:hint="default"/>
+              <w:lang w:val="en-US"/>
+            </w:rPr>
+            <w:t>SYNTHESIS OF STRUCTURE- ENGINE</w:t>
+          </w:r>
+          <w:r>
+            <w:tab/>
+          </w:r>
+          <w:r>
+            <w:fldChar w:fldCharType="begin"/>
+          </w:r>
+          <w:r>
+            <w:instrText xml:space="preserve"> PAGEREF _Toc17030 \h </w:instrText>
+          </w:r>
+          <w:r>
+            <w:fldChar w:fldCharType="separate"/>
+          </w:r>
+          <w:r>
+            <w:t>23</w:t>
           </w:r>
           <w:r>
             <w:fldChar w:fldCharType="end"/>
@@ -849,546 +1389,6 @@
             <w:fldChar w:fldCharType="begin"/>
           </w:r>
           <w:r>
-            <w:instrText xml:space="preserve"> HYPERLINK \l _Toc32698 </w:instrText>
-          </w:r>
-          <w:r>
-            <w:fldChar w:fldCharType="separate"/>
-          </w:r>
-          <w:r>
-            <w:rPr>
-              <w:rFonts w:hint="default"/>
-              <w:lang w:val="en-US"/>
-            </w:rPr>
-            <w:t>PLANTVILLAGE</w:t>
-          </w:r>
-          <w:r>
-            <w:tab/>
-          </w:r>
-          <w:r>
-            <w:fldChar w:fldCharType="begin"/>
-          </w:r>
-          <w:r>
-            <w:instrText xml:space="preserve"> PAGEREF _Toc32698 \h </w:instrText>
-          </w:r>
-          <w:r>
-            <w:fldChar w:fldCharType="separate"/>
-          </w:r>
-          <w:r>
-            <w:t>12</w:t>
-          </w:r>
-          <w:r>
-            <w:fldChar w:fldCharType="end"/>
-          </w:r>
-          <w:r>
-            <w:fldChar w:fldCharType="end"/>
-          </w:r>
-        </w:p>
-        <w:p>
-          <w:pPr>
-            <w:pStyle w:val="16"/>
-            <w:tabs>
-              <w:tab w:val="right" w:leader="dot" w:pos="9071"/>
-            </w:tabs>
-          </w:pPr>
-          <w:r>
-            <w:fldChar w:fldCharType="begin"/>
-          </w:r>
-          <w:r>
-            <w:instrText xml:space="preserve"> HYPERLINK \l _Toc14617 </w:instrText>
-          </w:r>
-          <w:r>
-            <w:fldChar w:fldCharType="separate"/>
-          </w:r>
-          <w:r>
-            <w:rPr>
-              <w:rFonts w:hint="default"/>
-              <w:lang w:val="en-US"/>
-            </w:rPr>
-            <w:t>PLANTDOC</w:t>
-          </w:r>
-          <w:r>
-            <w:tab/>
-          </w:r>
-          <w:r>
-            <w:fldChar w:fldCharType="begin"/>
-          </w:r>
-          <w:r>
-            <w:instrText xml:space="preserve"> PAGEREF _Toc14617 \h </w:instrText>
-          </w:r>
-          <w:r>
-            <w:fldChar w:fldCharType="separate"/>
-          </w:r>
-          <w:r>
-            <w:t>13</w:t>
-          </w:r>
-          <w:r>
-            <w:fldChar w:fldCharType="end"/>
-          </w:r>
-          <w:r>
-            <w:fldChar w:fldCharType="end"/>
-          </w:r>
-        </w:p>
-        <w:p>
-          <w:pPr>
-            <w:pStyle w:val="15"/>
-            <w:tabs>
-              <w:tab w:val="right" w:leader="dot" w:pos="9071"/>
-            </w:tabs>
-          </w:pPr>
-          <w:r>
-            <w:fldChar w:fldCharType="begin"/>
-          </w:r>
-          <w:r>
-            <w:instrText xml:space="preserve"> HYPERLINK \l _Toc15893 </w:instrText>
-          </w:r>
-          <w:r>
-            <w:fldChar w:fldCharType="separate"/>
-          </w:r>
-          <w:r>
-            <w:rPr>
-              <w:rFonts w:hint="default"/>
-              <w:lang w:val="en-US"/>
-            </w:rPr>
-            <w:t>EXISTING PLANT DISEASE CLASSIFICATION MODELS</w:t>
-          </w:r>
-          <w:r>
-            <w:tab/>
-          </w:r>
-          <w:r>
-            <w:fldChar w:fldCharType="begin"/>
-          </w:r>
-          <w:r>
-            <w:instrText xml:space="preserve"> PAGEREF _Toc15893 \h </w:instrText>
-          </w:r>
-          <w:r>
-            <w:fldChar w:fldCharType="separate"/>
-          </w:r>
-          <w:r>
-            <w:t>14</w:t>
-          </w:r>
-          <w:r>
-            <w:fldChar w:fldCharType="end"/>
-          </w:r>
-          <w:r>
-            <w:fldChar w:fldCharType="end"/>
-          </w:r>
-        </w:p>
-        <w:p>
-          <w:pPr>
-            <w:pStyle w:val="16"/>
-            <w:tabs>
-              <w:tab w:val="right" w:leader="dot" w:pos="9071"/>
-            </w:tabs>
-          </w:pPr>
-          <w:r>
-            <w:fldChar w:fldCharType="begin"/>
-          </w:r>
-          <w:r>
-            <w:instrText xml:space="preserve"> HYPERLINK \l _Toc31047 </w:instrText>
-          </w:r>
-          <w:r>
-            <w:fldChar w:fldCharType="separate"/>
-          </w:r>
-          <w:r>
-            <w:rPr>
-              <w:rFonts w:hint="default"/>
-              <w:lang w:val="en-US"/>
-            </w:rPr>
-            <w:t>MOHANTY ET AL. [6]</w:t>
-          </w:r>
-          <w:r>
-            <w:tab/>
-          </w:r>
-          <w:r>
-            <w:fldChar w:fldCharType="begin"/>
-          </w:r>
-          <w:r>
-            <w:instrText xml:space="preserve"> PAGEREF _Toc31047 \h </w:instrText>
-          </w:r>
-          <w:r>
-            <w:fldChar w:fldCharType="separate"/>
-          </w:r>
-          <w:r>
-            <w:t>14</w:t>
-          </w:r>
-          <w:r>
-            <w:fldChar w:fldCharType="end"/>
-          </w:r>
-          <w:r>
-            <w:fldChar w:fldCharType="end"/>
-          </w:r>
-        </w:p>
-        <w:p>
-          <w:pPr>
-            <w:pStyle w:val="16"/>
-            <w:tabs>
-              <w:tab w:val="right" w:leader="dot" w:pos="9071"/>
-            </w:tabs>
-          </w:pPr>
-          <w:r>
-            <w:fldChar w:fldCharType="begin"/>
-          </w:r>
-          <w:r>
-            <w:instrText xml:space="preserve"> HYPERLINK \l _Toc4335 </w:instrText>
-          </w:r>
-          <w:r>
-            <w:fldChar w:fldCharType="separate"/>
-          </w:r>
-          <w:r>
-            <w:rPr>
-              <w:rFonts w:hint="default"/>
-              <w:lang w:val="en-US"/>
-            </w:rPr>
-            <w:t>SALMAN ET AL. [1]</w:t>
-          </w:r>
-          <w:r>
-            <w:tab/>
-          </w:r>
-          <w:r>
-            <w:fldChar w:fldCharType="begin"/>
-          </w:r>
-          <w:r>
-            <w:instrText xml:space="preserve"> PAGEREF _Toc4335 \h </w:instrText>
-          </w:r>
-          <w:r>
-            <w:fldChar w:fldCharType="separate"/>
-          </w:r>
-          <w:r>
-            <w:t>15</w:t>
-          </w:r>
-          <w:r>
-            <w:fldChar w:fldCharType="end"/>
-          </w:r>
-          <w:r>
-            <w:fldChar w:fldCharType="end"/>
-          </w:r>
-        </w:p>
-        <w:p>
-          <w:pPr>
-            <w:pStyle w:val="14"/>
-            <w:tabs>
-              <w:tab w:val="right" w:leader="dot" w:pos="9071"/>
-            </w:tabs>
-          </w:pPr>
-          <w:r>
-            <w:fldChar w:fldCharType="begin"/>
-          </w:r>
-          <w:r>
-            <w:instrText xml:space="preserve"> HYPERLINK \l _Toc14127 </w:instrText>
-          </w:r>
-          <w:r>
-            <w:fldChar w:fldCharType="separate"/>
-          </w:r>
-          <w:r>
-            <w:rPr>
-              <w:rFonts w:hint="default"/>
-              <w:lang w:val="en-US"/>
-            </w:rPr>
-            <w:t>Ⅲ. SYSTEM DESIGN</w:t>
-          </w:r>
-          <w:r>
-            <w:tab/>
-          </w:r>
-          <w:r>
-            <w:fldChar w:fldCharType="begin"/>
-          </w:r>
-          <w:r>
-            <w:instrText xml:space="preserve"> PAGEREF _Toc14127 \h </w:instrText>
-          </w:r>
-          <w:r>
-            <w:fldChar w:fldCharType="separate"/>
-          </w:r>
-          <w:r>
-            <w:t>17</w:t>
-          </w:r>
-          <w:r>
-            <w:fldChar w:fldCharType="end"/>
-          </w:r>
-          <w:r>
-            <w:fldChar w:fldCharType="end"/>
-          </w:r>
-        </w:p>
-        <w:p>
-          <w:pPr>
-            <w:pStyle w:val="15"/>
-            <w:tabs>
-              <w:tab w:val="right" w:leader="dot" w:pos="9071"/>
-            </w:tabs>
-          </w:pPr>
-          <w:r>
-            <w:fldChar w:fldCharType="begin"/>
-          </w:r>
-          <w:r>
-            <w:instrText xml:space="preserve"> HYPERLINK \l _Toc25081 </w:instrText>
-          </w:r>
-          <w:r>
-            <w:fldChar w:fldCharType="separate"/>
-          </w:r>
-          <w:r>
-            <w:rPr>
-              <w:rFonts w:hint="default"/>
-              <w:lang w:val="en-US"/>
-            </w:rPr>
-            <w:t>GOALS AND OBJECTIVES</w:t>
-          </w:r>
-          <w:r>
-            <w:tab/>
-          </w:r>
-          <w:r>
-            <w:fldChar w:fldCharType="begin"/>
-          </w:r>
-          <w:r>
-            <w:instrText xml:space="preserve"> PAGEREF _Toc25081 \h </w:instrText>
-          </w:r>
-          <w:r>
-            <w:fldChar w:fldCharType="separate"/>
-          </w:r>
-          <w:r>
-            <w:t>17</w:t>
-          </w:r>
-          <w:r>
-            <w:fldChar w:fldCharType="end"/>
-          </w:r>
-          <w:r>
-            <w:fldChar w:fldCharType="end"/>
-          </w:r>
-        </w:p>
-        <w:p>
-          <w:pPr>
-            <w:pStyle w:val="15"/>
-            <w:tabs>
-              <w:tab w:val="right" w:leader="dot" w:pos="9071"/>
-            </w:tabs>
-          </w:pPr>
-          <w:r>
-            <w:fldChar w:fldCharType="begin"/>
-          </w:r>
-          <w:r>
-            <w:instrText xml:space="preserve"> HYPERLINK \l _Toc6510 </w:instrText>
-          </w:r>
-          <w:r>
-            <w:fldChar w:fldCharType="separate"/>
-          </w:r>
-          <w:r>
-            <w:rPr>
-              <w:rFonts w:hint="default"/>
-              <w:lang w:val="en-US"/>
-            </w:rPr>
-            <w:t>WEB MODULE</w:t>
-          </w:r>
-          <w:r>
-            <w:tab/>
-          </w:r>
-          <w:r>
-            <w:fldChar w:fldCharType="begin"/>
-          </w:r>
-          <w:r>
-            <w:instrText xml:space="preserve"> PAGEREF _Toc6510 \h </w:instrText>
-          </w:r>
-          <w:r>
-            <w:fldChar w:fldCharType="separate"/>
-          </w:r>
-          <w:r>
-            <w:t>18</w:t>
-          </w:r>
-          <w:r>
-            <w:fldChar w:fldCharType="end"/>
-          </w:r>
-          <w:r>
-            <w:fldChar w:fldCharType="end"/>
-          </w:r>
-        </w:p>
-        <w:p>
-          <w:pPr>
-            <w:pStyle w:val="16"/>
-            <w:tabs>
-              <w:tab w:val="right" w:leader="dot" w:pos="9071"/>
-            </w:tabs>
-          </w:pPr>
-          <w:r>
-            <w:fldChar w:fldCharType="begin"/>
-          </w:r>
-          <w:r>
-            <w:instrText xml:space="preserve"> HYPERLINK \l _Toc23106 </w:instrText>
-          </w:r>
-          <w:r>
-            <w:fldChar w:fldCharType="separate"/>
-          </w:r>
-          <w:r>
-            <w:rPr>
-              <w:rFonts w:hint="default"/>
-              <w:lang w:val="en-US"/>
-            </w:rPr>
-            <w:t>SYSTEM FUNCTIONS</w:t>
-          </w:r>
-          <w:r>
-            <w:tab/>
-          </w:r>
-          <w:r>
-            <w:fldChar w:fldCharType="begin"/>
-          </w:r>
-          <w:r>
-            <w:instrText xml:space="preserve"> PAGEREF _Toc23106 \h </w:instrText>
-          </w:r>
-          <w:r>
-            <w:fldChar w:fldCharType="separate"/>
-          </w:r>
-          <w:r>
-            <w:t>18</w:t>
-          </w:r>
-          <w:r>
-            <w:fldChar w:fldCharType="end"/>
-          </w:r>
-          <w:r>
-            <w:fldChar w:fldCharType="end"/>
-          </w:r>
-        </w:p>
-        <w:p>
-          <w:pPr>
-            <w:pStyle w:val="16"/>
-            <w:tabs>
-              <w:tab w:val="right" w:leader="dot" w:pos="9071"/>
-            </w:tabs>
-          </w:pPr>
-          <w:r>
-            <w:fldChar w:fldCharType="begin"/>
-          </w:r>
-          <w:r>
-            <w:instrText xml:space="preserve"> HYPERLINK \l _Toc30234 </w:instrText>
-          </w:r>
-          <w:r>
-            <w:fldChar w:fldCharType="separate"/>
-          </w:r>
-          <w:r>
-            <w:rPr>
-              <w:rFonts w:hint="default"/>
-              <w:lang w:val="en-US"/>
-            </w:rPr>
-            <w:t>SYNTHESIS OF STRUCTURE - FRONTEND</w:t>
-          </w:r>
-          <w:r>
-            <w:tab/>
-          </w:r>
-          <w:r>
-            <w:fldChar w:fldCharType="begin"/>
-          </w:r>
-          <w:r>
-            <w:instrText xml:space="preserve"> PAGEREF _Toc30234 \h </w:instrText>
-          </w:r>
-          <w:r>
-            <w:fldChar w:fldCharType="separate"/>
-          </w:r>
-          <w:r>
-            <w:t>19</w:t>
-          </w:r>
-          <w:r>
-            <w:fldChar w:fldCharType="end"/>
-          </w:r>
-          <w:r>
-            <w:fldChar w:fldCharType="end"/>
-          </w:r>
-        </w:p>
-        <w:p>
-          <w:pPr>
-            <w:pStyle w:val="16"/>
-            <w:tabs>
-              <w:tab w:val="right" w:leader="dot" w:pos="9071"/>
-            </w:tabs>
-          </w:pPr>
-          <w:r>
-            <w:fldChar w:fldCharType="begin"/>
-          </w:r>
-          <w:r>
-            <w:instrText xml:space="preserve"> HYPERLINK \l _Toc3018 </w:instrText>
-          </w:r>
-          <w:r>
-            <w:fldChar w:fldCharType="separate"/>
-          </w:r>
-          <w:r>
-            <w:rPr>
-              <w:rFonts w:hint="default"/>
-              <w:lang w:val="en-US"/>
-            </w:rPr>
-            <w:t>SYNTHESIS OF STRUCTURE - BACKEND</w:t>
-          </w:r>
-          <w:r>
-            <w:tab/>
-          </w:r>
-          <w:r>
-            <w:fldChar w:fldCharType="begin"/>
-          </w:r>
-          <w:r>
-            <w:instrText xml:space="preserve"> PAGEREF _Toc3018 \h </w:instrText>
-          </w:r>
-          <w:r>
-            <w:fldChar w:fldCharType="separate"/>
-          </w:r>
-          <w:r>
-            <w:t>21</w:t>
-          </w:r>
-          <w:r>
-            <w:fldChar w:fldCharType="end"/>
-          </w:r>
-          <w:r>
-            <w:fldChar w:fldCharType="end"/>
-          </w:r>
-        </w:p>
-        <w:p>
-          <w:pPr>
-            <w:pStyle w:val="16"/>
-            <w:tabs>
-              <w:tab w:val="right" w:leader="dot" w:pos="9071"/>
-            </w:tabs>
-          </w:pPr>
-          <w:r>
-            <w:fldChar w:fldCharType="begin"/>
-          </w:r>
-          <w:r>
-            <w:instrText xml:space="preserve"> HYPERLINK \l _Toc17030 </w:instrText>
-          </w:r>
-          <w:r>
-            <w:fldChar w:fldCharType="separate"/>
-          </w:r>
-          <w:r>
-            <w:rPr>
-              <w:rFonts w:hint="default"/>
-              <w:lang w:val="en-US"/>
-            </w:rPr>
-            <w:t>SYNTHESIS OF STRUCTURE- ENGINE</w:t>
-          </w:r>
-          <w:r>
-            <w:tab/>
-          </w:r>
-          <w:r>
-            <w:fldChar w:fldCharType="begin"/>
-          </w:r>
-          <w:r>
-            <w:instrText xml:space="preserve"> PAGEREF _Toc17030 \h </w:instrText>
-          </w:r>
-          <w:r>
-            <w:fldChar w:fldCharType="separate"/>
-          </w:r>
-          <w:r>
-            <w:t>23</w:t>
-          </w:r>
-          <w:r>
-            <w:fldChar w:fldCharType="end"/>
-          </w:r>
-          <w:r>
-            <w:fldChar w:fldCharType="end"/>
-          </w:r>
-        </w:p>
-        <w:p>
-          <w:pPr>
-            <w:pStyle w:val="15"/>
-            <w:tabs>
-              <w:tab w:val="right" w:leader="dot" w:pos="9071"/>
-            </w:tabs>
-          </w:pPr>
-          <w:r>
-            <w:fldChar w:fldCharType="begin"/>
-          </w:r>
-          <w:r>
             <w:instrText xml:space="preserve"> HYPERLINK \l _Toc23704 </w:instrText>
           </w:r>
           <w:r>
@@ -1425,7 +1425,7 @@
         </w:p>
         <w:p>
           <w:pPr>
-            <w:pStyle w:val="16"/>
+            <w:pStyle w:val="17"/>
             <w:tabs>
               <w:tab w:val="right" w:leader="dot" w:pos="9071"/>
             </w:tabs>
@@ -1470,7 +1470,7 @@
         </w:p>
         <w:p>
           <w:pPr>
-            <w:pStyle w:val="16"/>
+            <w:pStyle w:val="17"/>
             <w:tabs>
               <w:tab w:val="right" w:leader="dot" w:pos="9071"/>
             </w:tabs>
@@ -1515,7 +1515,7 @@
         </w:p>
         <w:p>
           <w:pPr>
-            <w:pStyle w:val="16"/>
+            <w:pStyle w:val="17"/>
             <w:tabs>
               <w:tab w:val="right" w:leader="dot" w:pos="9071"/>
             </w:tabs>
@@ -1560,7 +1560,7 @@
         </w:p>
         <w:p>
           <w:pPr>
-            <w:pStyle w:val="14"/>
+            <w:pStyle w:val="15"/>
             <w:tabs>
               <w:tab w:val="right" w:leader="dot" w:pos="9071"/>
             </w:tabs>
@@ -1682,8 +1682,8 @@
           <w:lang w:val="en-US"/>
         </w:rPr>
       </w:pPr>
-      <w:bookmarkStart w:id="0" w:name="_Toc1265"/>
-      <w:bookmarkStart w:id="1" w:name="_Toc17979"/>
+      <w:bookmarkStart w:id="0" w:name="_Toc17979"/>
+      <w:bookmarkStart w:id="1" w:name="_Toc1265"/>
       <w:r>
         <w:rPr>
           <w:rFonts w:hint="default"/>
@@ -2178,8 +2178,6 @@
         </w:rPr>
         <w:br w:type="page"/>
       </w:r>
-      <w:bookmarkStart w:id="26" w:name="_GoBack"/>
-      <w:bookmarkEnd w:id="26"/>
     </w:p>
     <w:p>
       <w:pPr>
@@ -2190,8 +2188,8 @@
           <w:lang w:val="en-US"/>
         </w:rPr>
       </w:pPr>
-      <w:bookmarkStart w:id="2" w:name="_Toc12403"/>
-      <w:bookmarkStart w:id="3" w:name="_Toc17518"/>
+      <w:bookmarkStart w:id="2" w:name="_Toc17518"/>
+      <w:bookmarkStart w:id="3" w:name="_Toc12403"/>
       <w:r>
         <w:rPr>
           <w:rFonts w:hint="default"/>
@@ -2428,7 +2426,7 @@
       </w:r>
       <w:r>
         <w:rPr>
-          <w:rStyle w:val="18"/>
+          <w:rStyle w:val="19"/>
           <w:rFonts w:hint="default"/>
           <w:lang w:val="en-US"/>
         </w:rPr>
@@ -2759,7 +2757,7 @@
           </mc:Choice>
           <mc:Fallback>
             <w:pict>
-              <v:shape id="_x0000_s1026" o:spid="_x0000_s1026" o:spt="202" type="#_x0000_t202" style="position:absolute;left:0pt;margin-left:401pt;margin-top:270.5pt;height:26.75pt;width:48.7pt;z-index:251661312;mso-width-relative:page;mso-height-relative:page;" fillcolor="#FFFFFF [3201]" filled="t" stroked="f" coordsize="21600,21600" o:gfxdata="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">
+              <v:shape id="_x0000_s1026" o:spid="_x0000_s1026" o:spt="202" type="#_x0000_t202" style="position:absolute;left:0pt;margin-left:401pt;margin-top:270.5pt;height:26.75pt;width:48.7pt;z-index:251661312;mso-width-relative:page;mso-height-relative:page;" fillcolor="#FFFFFF [3201]" filled="t" stroked="f" coordsize="21600,21600" o:gfxdata="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">
                 <v:fill on="t" focussize="0,0"/>
                 <v:stroke on="f" weight="0.5pt"/>
                 <v:imagedata o:title=""/>
@@ -4409,7 +4407,7 @@
       </w:pPr>
       <w:r>
         <w:rPr>
-          <w:rStyle w:val="13"/>
+          <w:rStyle w:val="14"/>
           <w:b w:val="0"/>
           <w:bCs w:val="0"/>
         </w:rPr>
@@ -4417,7 +4415,7 @@
       </w:r>
       <w:r>
         <w:rPr>
-          <w:rStyle w:val="13"/>
+          <w:rStyle w:val="14"/>
           <w:rFonts w:hint="default"/>
           <w:b w:val="0"/>
           <w:bCs w:val="0"/>
@@ -4451,7 +4449,7 @@
       </w:pPr>
       <w:r>
         <w:rPr>
-          <w:rStyle w:val="13"/>
+          <w:rStyle w:val="14"/>
           <w:b w:val="0"/>
           <w:bCs w:val="0"/>
         </w:rPr>
@@ -4459,7 +4457,7 @@
       </w:r>
       <w:r>
         <w:rPr>
-          <w:rStyle w:val="13"/>
+          <w:rStyle w:val="14"/>
           <w:rFonts w:hint="default"/>
           <w:b w:val="0"/>
           <w:bCs w:val="0"/>
@@ -4503,7 +4501,7 @@
       </w:pPr>
       <w:r>
         <w:rPr>
-          <w:rStyle w:val="13"/>
+          <w:rStyle w:val="14"/>
           <w:b w:val="0"/>
           <w:bCs w:val="0"/>
         </w:rPr>
@@ -4511,7 +4509,7 @@
       </w:r>
       <w:r>
         <w:rPr>
-          <w:rStyle w:val="13"/>
+          <w:rStyle w:val="14"/>
           <w:rFonts w:hint="default"/>
           <w:b w:val="0"/>
           <w:bCs w:val="0"/>
@@ -4795,7 +4793,7 @@
         <w:bidi w:val="0"/>
         <w:jc w:val="center"/>
         <w:rPr>
-          <w:rStyle w:val="18"/>
+          <w:rStyle w:val="19"/>
           <w:rFonts w:hint="default"/>
           <w:lang w:val="en-US"/>
         </w:rPr>
@@ -4848,7 +4846,7 @@
       </w:r>
       <w:r>
         <w:rPr>
-          <w:rStyle w:val="18"/>
+          <w:rStyle w:val="19"/>
           <w:rFonts w:hint="default"/>
           <w:lang w:val="en-US"/>
         </w:rPr>
@@ -5135,14 +5133,14 @@
         <w:bidi w:val="0"/>
         <w:jc w:val="center"/>
         <w:rPr>
-          <w:rStyle w:val="18"/>
-          <w:rFonts w:hint="default"/>
-          <w:lang w:val="en-US"/>
-        </w:rPr>
-      </w:pPr>
-      <w:r>
-        <w:rPr>
-          <w:rStyle w:val="18"/>
+          <w:rStyle w:val="19"/>
+          <w:rFonts w:hint="default"/>
+          <w:lang w:val="en-US"/>
+        </w:rPr>
+      </w:pPr>
+      <w:r>
+        <w:rPr>
+          <w:rStyle w:val="19"/>
           <w:rFonts w:hint="default"/>
           <w:lang w:val="en-US"/>
         </w:rPr>
@@ -5155,7 +5153,7 @@
       </w:pPr>
       <w:r>
         <w:rPr>
-          <w:rStyle w:val="18"/>
+          <w:rStyle w:val="19"/>
           <w:rFonts w:hint="default"/>
           <w:lang w:val="en-US"/>
         </w:rPr>
@@ -5415,14 +5413,14 @@
         <w:bidi w:val="0"/>
         <w:jc w:val="center"/>
         <w:rPr>
-          <w:rStyle w:val="18"/>
-          <w:rFonts w:hint="default"/>
-          <w:lang w:val="en-US"/>
-        </w:rPr>
-      </w:pPr>
-      <w:r>
-        <w:rPr>
-          <w:rStyle w:val="18"/>
+          <w:rStyle w:val="19"/>
+          <w:rFonts w:hint="default"/>
+          <w:lang w:val="en-US"/>
+        </w:rPr>
+      </w:pPr>
+      <w:r>
+        <w:rPr>
+          <w:rStyle w:val="19"/>
           <w:rFonts w:hint="default"/>
           <w:lang w:val="en-US"/>
         </w:rPr>
@@ -5712,14 +5710,14 @@
       <w:pPr>
         <w:jc w:val="center"/>
         <w:rPr>
-          <w:rStyle w:val="18"/>
-          <w:rFonts w:hint="default"/>
-          <w:lang w:val="en-US"/>
-        </w:rPr>
-      </w:pPr>
-      <w:r>
-        <w:rPr>
-          <w:rStyle w:val="18"/>
+          <w:rStyle w:val="19"/>
+          <w:rFonts w:hint="default"/>
+          <w:lang w:val="en-US"/>
+        </w:rPr>
+      </w:pPr>
+      <w:r>
+        <w:rPr>
+          <w:rStyle w:val="19"/>
           <w:rFonts w:hint="default"/>
           <w:lang w:val="en-US"/>
         </w:rPr>
@@ -5732,7 +5730,7 @@
       </w:pPr>
       <w:r>
         <w:rPr>
-          <w:rStyle w:val="18"/>
+          <w:rStyle w:val="19"/>
           <w:rFonts w:hint="default"/>
           <w:lang w:val="en-US"/>
         </w:rPr>
@@ -5816,7 +5814,7 @@
       </w:pPr>
       <w:r>
         <w:rPr>
-          <w:rStyle w:val="18"/>
+          <w:rStyle w:val="19"/>
           <w:rFonts w:hint="default"/>
           <w:lang w:val="en-US"/>
         </w:rPr>
@@ -5921,10 +5919,6 @@
       <w:pPr>
         <w:bidi w:val="0"/>
         <w:ind w:firstLine="850" w:firstLineChars="0"/>
-        <w:rPr>
-          <w:rFonts w:hint="default"/>
-          <w:lang w:val="en-US"/>
-        </w:rPr>
       </w:pPr>
       <w:r>
         <w:t>This axis is motivated by the hypothesis that while ImageNet-pretrained features are broadly transferable, the highest-level convolutional representations</w:t>
@@ -5948,6 +5942,1043 @@
       </w:r>
       <w:r>
         <w:t xml:space="preserve"> may benefit from adaptation to the visual characteristics of diseased plant leaves, potentially improving the model's ability to generalize across the domain gap between PlantVillage's controlled conditions and real-world field images.</w:t>
+      </w:r>
+    </w:p>
+    <w:p>
+      <w:r>
+        <w:br w:type="page"/>
+      </w:r>
+    </w:p>
+    <w:p>
+      <w:pPr>
+        <w:pStyle w:val="2"/>
+        <w:bidi w:val="0"/>
+        <w:rPr>
+          <w:rFonts w:hint="default"/>
+          <w:lang w:val="en-US"/>
+        </w:rPr>
+      </w:pPr>
+      <w:r>
+        <w:rPr>
+          <w:rFonts w:hint="default"/>
+          <w:lang w:val="en-US"/>
+        </w:rPr>
+        <w:t>Ⅳ. SOFTWARE IMPLEMENTATION</w:t>
+      </w:r>
+    </w:p>
+    <w:p>
+      <w:pPr>
+        <w:pStyle w:val="4"/>
+        <w:bidi w:val="0"/>
+        <w:rPr>
+          <w:rFonts w:hint="default"/>
+          <w:lang w:val="en-US"/>
+        </w:rPr>
+      </w:pPr>
+      <w:r>
+        <w:rPr>
+          <w:rFonts w:hint="default"/>
+          <w:lang w:val="en-US"/>
+        </w:rPr>
+        <w:t>FRONTEND</w:t>
+      </w:r>
+    </w:p>
+    <w:p>
+      <w:pPr>
+        <w:bidi w:val="0"/>
+        <w:ind w:firstLine="850" w:firstLineChars="0"/>
+      </w:pPr>
+      <w:r>
+        <w:t xml:space="preserve">The frontend module is implemented as a single-page Angular application consisting of </w:t>
+      </w:r>
+      <w:r>
+        <w:rPr>
+          <w:rFonts w:hint="default"/>
+          <w:lang w:val="en-US"/>
+        </w:rPr>
+        <w:t xml:space="preserve">four </w:t>
+      </w:r>
+      <w:r>
+        <w:t xml:space="preserve">components and five services, organized under a single root application module. The project follows Angular's standard directory conventions, with </w:t>
+      </w:r>
+      <w:r>
+        <w:rPr>
+          <w:i/>
+          <w:iCs/>
+        </w:rPr>
+        <w:t>components</w:t>
+      </w:r>
+      <w:r>
+        <w:t xml:space="preserve"> grouped under </w:t>
+      </w:r>
+      <w:r>
+        <w:rPr>
+          <w:b w:val="0"/>
+          <w:bCs w:val="0"/>
+          <w:i/>
+          <w:iCs/>
+        </w:rPr>
+        <w:t>src/app/components</w:t>
+      </w:r>
+      <w:r>
+        <w:t xml:space="preserve"> and </w:t>
+      </w:r>
+      <w:r>
+        <w:rPr>
+          <w:i/>
+          <w:iCs/>
+        </w:rPr>
+        <w:t>services</w:t>
+      </w:r>
+      <w:r>
+        <w:t xml:space="preserve"> under </w:t>
+      </w:r>
+      <w:r>
+        <w:rPr>
+          <w:b w:val="0"/>
+          <w:bCs w:val="0"/>
+          <w:i/>
+          <w:iCs/>
+        </w:rPr>
+        <w:t>src/app/services</w:t>
+      </w:r>
+      <w:r>
+        <w:t>.</w:t>
+      </w:r>
+    </w:p>
+    <w:p>
+      <w:pPr>
+        <w:pStyle w:val="5"/>
+        <w:bidi w:val="0"/>
+        <w:rPr>
+          <w:rFonts w:hint="default"/>
+          <w:lang w:val="en-US"/>
+        </w:rPr>
+      </w:pPr>
+      <w:r>
+        <w:rPr>
+          <w:rFonts w:hint="default"/>
+          <w:lang w:val="en-US"/>
+        </w:rPr>
+        <w:t>PROJECT STRUCTURE</w:t>
+      </w:r>
+    </w:p>
+    <w:p>
+      <w:pPr>
+        <w:bidi w:val="0"/>
+        <w:ind w:firstLine="850" w:firstLineChars="0"/>
+      </w:pPr>
+      <w:r>
+        <w:t>The application is composed of the following components and services:</w:t>
+      </w:r>
+    </w:p>
+    <w:p>
+      <w:pPr>
+        <w:bidi w:val="0"/>
+        <w:ind w:firstLine="850" w:firstLineChars="0"/>
+        <w:rPr>
+          <w:b/>
+          <w:bCs/>
+          <w:i/>
+          <w:iCs/>
+        </w:rPr>
+      </w:pPr>
+      <w:r>
+        <w:rPr>
+          <w:b/>
+          <w:bCs/>
+          <w:i/>
+          <w:iCs/>
+        </w:rPr>
+        <w:t>Components:</w:t>
+      </w:r>
+    </w:p>
+    <w:p>
+      <w:pPr>
+        <w:bidi w:val="0"/>
+        <w:ind w:firstLine="850" w:firstLineChars="0"/>
+        <w:rPr>
+          <w:rFonts w:hint="default"/>
+          <w:lang w:val="en-US"/>
+        </w:rPr>
+      </w:pPr>
+      <w:r>
+        <w:rPr>
+          <w:rFonts w:hint="default"/>
+          <w:b/>
+          <w:bCs/>
+          <w:lang w:val="en-US"/>
+        </w:rPr>
+        <w:t>a</w:t>
+      </w:r>
+      <w:r>
+        <w:rPr>
+          <w:b/>
+          <w:bCs/>
+        </w:rPr>
+        <w:t>pp</w:t>
+      </w:r>
+      <w:r>
+        <w:rPr>
+          <w:rFonts w:hint="default"/>
+          <w:b/>
+          <w:bCs/>
+          <w:lang w:val="en-US"/>
+        </w:rPr>
+        <w:t xml:space="preserve"> -</w:t>
+      </w:r>
+      <w:r>
+        <w:t xml:space="preserve"> The root </w:t>
+      </w:r>
+      <w:r>
+        <w:rPr>
+          <w:rFonts w:hint="default"/>
+          <w:lang w:val="en-US"/>
+        </w:rPr>
+        <w:t>component</w:t>
+      </w:r>
+      <w:r>
+        <w:t xml:space="preserve"> serves as the top-level composition layer, orchestrating the interaction </w:t>
+      </w:r>
+      <w:bookmarkStart w:id="26" w:name="_GoBack"/>
+      <w:r>
+        <w:t>b</w:t>
+      </w:r>
+      <w:bookmarkEnd w:id="26"/>
+      <w:r>
+        <w:t xml:space="preserve">etween the </w:t>
+      </w:r>
+      <w:r>
+        <w:rPr>
+          <w:i/>
+          <w:iCs/>
+        </w:rPr>
+        <w:t>image-upload</w:t>
+      </w:r>
+      <w:r>
+        <w:t xml:space="preserve"> and </w:t>
+      </w:r>
+      <w:r>
+        <w:rPr>
+          <w:i/>
+          <w:iCs/>
+        </w:rPr>
+        <w:t>prediction-result</w:t>
+      </w:r>
+      <w:r>
+        <w:t xml:space="preserve"> components. Communication between the two</w:t>
+      </w:r>
+      <w:r>
+        <w:rPr>
+          <w:rFonts w:hint="default"/>
+          <w:lang w:val="en-US"/>
+        </w:rPr>
+        <w:t xml:space="preserve"> components</w:t>
+      </w:r>
+      <w:r>
+        <w:t xml:space="preserve"> is handled via Angular's standard input/output binding mechanism </w:t>
+      </w:r>
+      <w:r>
+        <w:rPr>
+          <w:rFonts w:hint="default"/>
+          <w:lang w:val="en-US"/>
+        </w:rPr>
+        <w:t>-</w:t>
+      </w:r>
+      <w:r>
+        <w:t xml:space="preserve"> image-upload emits an </w:t>
+      </w:r>
+      <w:r>
+        <w:rPr>
+          <w:i/>
+          <w:iCs/>
+        </w:rPr>
+        <w:t>onImageReady</w:t>
+      </w:r>
+      <w:r>
+        <w:t xml:space="preserve"> event carrying the preprocessed image blob upon successful file selection, which </w:t>
+      </w:r>
+      <w:r>
+        <w:rPr>
+          <w:rFonts w:hint="default"/>
+          <w:i/>
+          <w:iCs/>
+          <w:lang w:val="en-US"/>
+        </w:rPr>
+        <w:t>app</w:t>
+      </w:r>
+      <w:r>
+        <w:t xml:space="preserve"> receives and stores in a signal via </w:t>
+      </w:r>
+      <w:r>
+        <w:rPr>
+          <w:i/>
+          <w:iCs/>
+        </w:rPr>
+        <w:t>selectedImageData</w:t>
+      </w:r>
+      <w:r>
+        <w:t>. This value is then passed downward to prediction-result as an input binding, which uses it to trigger the inference request and subsequently display the results. This unidirectional data flow keeps each component focused on a single responsibility while maintaining a clean and explicit communication contract between them.</w:t>
+      </w:r>
+    </w:p>
+    <w:p>
+      <w:pPr>
+        <w:bidi w:val="0"/>
+        <w:ind w:firstLine="850" w:firstLineChars="0"/>
+        <w:rPr>
+          <w:rFonts w:hint="default"/>
+          <w:i w:val="0"/>
+          <w:iCs w:val="0"/>
+          <w:lang w:val="en-US"/>
+        </w:rPr>
+      </w:pPr>
+      <w:r>
+        <w:rPr>
+          <w:b/>
+          <w:bCs/>
+        </w:rPr>
+        <w:t>image-upload</w:t>
+      </w:r>
+      <w:r>
+        <w:t xml:space="preserve"> </w:t>
+      </w:r>
+      <w:r>
+        <w:rPr>
+          <w:rFonts w:hint="default"/>
+          <w:lang w:val="en-US"/>
+        </w:rPr>
+        <w:t>-</w:t>
+      </w:r>
+      <w:r>
+        <w:t xml:space="preserve"> </w:t>
+      </w:r>
+      <w:r>
+        <w:t>responsible for rendering the drag-and-drop file upload area, accepting PNG, JPG, and WEBP formats, and preprocessing the uploaded image prior to submission. Upon file selection, the image is drawn onto a canvas element explicitly sized to the model's expected input dimensions</w:t>
+      </w:r>
+      <w:r>
+        <w:rPr>
+          <w:rFonts w:hint="default"/>
+          <w:lang w:val="en-US"/>
+        </w:rPr>
+        <w:t>,</w:t>
+      </w:r>
+      <w:r>
+        <w:t xml:space="preserve"> retrieved from the backend via </w:t>
+      </w:r>
+      <w:r>
+        <w:rPr>
+          <w:i/>
+          <w:iCs/>
+        </w:rPr>
+        <w:t>MetadataService</w:t>
+      </w:r>
+      <w:r>
+        <w:rPr>
+          <w:rFonts w:hint="default"/>
+          <w:i/>
+          <w:iCs/>
+          <w:lang w:val="en-US"/>
+        </w:rPr>
+        <w:t>,</w:t>
+      </w:r>
+      <w:r>
+        <w:t xml:space="preserve"> and the resized result is extracted </w:t>
+      </w:r>
+      <w:r>
+        <w:rPr>
+          <w:rFonts w:hint="default"/>
+          <w:lang w:val="en-US"/>
+        </w:rPr>
+        <w:t xml:space="preserve">from canvas </w:t>
+      </w:r>
+      <w:r>
+        <w:t xml:space="preserve">by calling </w:t>
+      </w:r>
+      <w:r>
+        <w:rPr>
+          <w:i/>
+          <w:iCs/>
+        </w:rPr>
+        <w:t>toBlob</w:t>
+      </w:r>
+      <w:r>
+        <w:rPr>
+          <w:rFonts w:hint="default"/>
+          <w:i/>
+          <w:iCs/>
+          <w:lang w:val="en-US"/>
+        </w:rPr>
+        <w:t xml:space="preserve"> </w:t>
+      </w:r>
+      <w:r>
+        <w:rPr>
+          <w:rFonts w:hint="default"/>
+          <w:i w:val="0"/>
+          <w:iCs w:val="0"/>
+          <w:lang w:val="en-US"/>
+        </w:rPr>
+        <w:t>method</w:t>
+      </w:r>
+      <w:r>
+        <w:t>, producing a PNG-encoded blob of the correct dimensions regardless of the original file's size or format. This ensures that the backend always receives an image of the expected input size without requiring any server-side resizing, and simultaneously provides the user with a visual preview of the image as it will be submitted to the model.</w:t>
+      </w:r>
+      <w:r>
+        <w:rPr>
+          <w:rFonts w:hint="default"/>
+          <w:lang w:val="en-US"/>
+        </w:rPr>
+        <w:t xml:space="preserve"> After resizing is done, </w:t>
+      </w:r>
+      <w:r>
+        <w:rPr>
+          <w:rFonts w:hint="default"/>
+          <w:i/>
+          <w:iCs/>
+          <w:lang w:val="en-US"/>
+        </w:rPr>
+        <w:t xml:space="preserve">image-upload </w:t>
+      </w:r>
+      <w:r>
+        <w:rPr>
+          <w:rFonts w:hint="default"/>
+          <w:i w:val="0"/>
+          <w:iCs w:val="0"/>
+          <w:lang w:val="en-US"/>
+        </w:rPr>
+        <w:t xml:space="preserve">component provides </w:t>
+      </w:r>
+      <w:r>
+        <w:rPr>
+          <w:rFonts w:hint="default"/>
+          <w:i/>
+          <w:iCs/>
+          <w:lang w:val="en-US"/>
+        </w:rPr>
+        <w:t xml:space="preserve">app </w:t>
+      </w:r>
+      <w:r>
+        <w:rPr>
+          <w:rFonts w:hint="default"/>
+          <w:i w:val="0"/>
+          <w:iCs w:val="0"/>
+          <w:lang w:val="en-US"/>
+        </w:rPr>
+        <w:t>component with blob that is ready for upload to backend.</w:t>
+      </w:r>
+    </w:p>
+    <w:p>
+      <w:pPr>
+        <w:bidi w:val="0"/>
+        <w:ind w:firstLine="850" w:firstLineChars="0"/>
+      </w:pPr>
+      <w:r>
+        <w:rPr>
+          <w:b/>
+          <w:bCs/>
+        </w:rPr>
+        <w:t>prediction-result</w:t>
+      </w:r>
+      <w:r>
+        <w:t xml:space="preserve"> </w:t>
+      </w:r>
+      <w:r>
+        <w:rPr>
+          <w:rFonts w:hint="default"/>
+          <w:lang w:val="en-US"/>
+        </w:rPr>
+        <w:t>-</w:t>
+      </w:r>
+      <w:r>
+        <w:t xml:space="preserve"> responsible for managing the inference lifecycle and presenting classification results to the user. The component receives the preprocessed image blob from </w:t>
+      </w:r>
+      <w:r>
+        <w:rPr>
+          <w:rFonts w:hint="default"/>
+          <w:i/>
+          <w:iCs/>
+          <w:lang w:val="en-US"/>
+        </w:rPr>
+        <w:t>app</w:t>
+      </w:r>
+      <w:r>
+        <w:t xml:space="preserve"> via input binding and remains in a locked state until a valid image is available, at which point the submit button is enabled. Upon the user pressing the button, the component dispatches the image to the backend via </w:t>
+      </w:r>
+      <w:r>
+        <w:rPr>
+          <w:i/>
+          <w:iCs/>
+        </w:rPr>
+        <w:t>InferenceService</w:t>
+      </w:r>
+      <w:r>
+        <w:t xml:space="preserve"> and receives in return a vector of 38 raw unnormalized logits</w:t>
+      </w:r>
+      <w:r>
+        <w:rPr>
+          <w:rFonts w:hint="default"/>
+          <w:lang w:val="en-US"/>
+        </w:rPr>
+        <w:t>,</w:t>
+      </w:r>
+      <w:r>
+        <w:t xml:space="preserve"> one per </w:t>
+      </w:r>
+      <w:r>
+        <w:rPr>
+          <w:i/>
+          <w:iCs/>
+        </w:rPr>
+        <w:t>PlantVillage</w:t>
+      </w:r>
+      <w:r>
+        <w:t xml:space="preserve"> class. Softmax is applied on the frontend to convert the logits into a proper probability distribution, after which the top-5 candidates are selected by sorting the resulting probabilities in descending order and taking the five highest-scoring entries. This design is intentional</w:t>
+      </w:r>
+      <w:r>
+        <w:rPr>
+          <w:rFonts w:hint="default"/>
+          <w:lang w:val="en-US"/>
+        </w:rPr>
+        <w:t>,</w:t>
+      </w:r>
+      <w:r>
+        <w:t xml:space="preserve"> by delegating softmax and top-N selection to the frontend, the engine is kept as simple and stateless as possible, with its sole responsibility being the execution of the forward pass and the return of raw logits.</w:t>
+      </w:r>
+    </w:p>
+    <w:p>
+      <w:pPr>
+        <w:bidi w:val="0"/>
+        <w:ind w:firstLine="850" w:firstLineChars="0"/>
+      </w:pPr>
+      <w:r>
+        <w:rPr>
+          <w:b/>
+          <w:bCs/>
+        </w:rPr>
+        <w:t>data-bar</w:t>
+      </w:r>
+      <w:r>
+        <w:t xml:space="preserve"> </w:t>
+      </w:r>
+      <w:r>
+        <w:rPr>
+          <w:rFonts w:hint="default"/>
+          <w:lang w:val="en-US"/>
+        </w:rPr>
+        <w:t>-</w:t>
+      </w:r>
+      <w:r>
+        <w:t xml:space="preserve"> a dedicated component encapsulating the animated confidence bar rendered within each prediction result row, extracted into its own component to isolate animation logic and prevent rendering conflicts that arise when animation is handled inline</w:t>
+      </w:r>
+    </w:p>
+    <w:p>
+      <w:pPr>
+        <w:bidi w:val="0"/>
+        <w:ind w:firstLine="850" w:firstLineChars="0"/>
+        <w:rPr>
+          <w:b/>
+          <w:bCs/>
+          <w:i/>
+          <w:iCs/>
+        </w:rPr>
+      </w:pPr>
+      <w:r>
+        <w:rPr>
+          <w:b/>
+          <w:bCs/>
+          <w:i/>
+          <w:iCs/>
+        </w:rPr>
+        <w:t>Services:</w:t>
+      </w:r>
+    </w:p>
+    <w:p>
+      <w:pPr>
+        <w:bidi w:val="0"/>
+        <w:ind w:firstLine="850" w:firstLineChars="0"/>
+      </w:pPr>
+      <w:r>
+        <w:rPr>
+          <w:b/>
+          <w:bCs/>
+          <w:i w:val="0"/>
+          <w:iCs w:val="0"/>
+        </w:rPr>
+        <w:t>ConfigService</w:t>
+      </w:r>
+      <w:r>
+        <w:t xml:space="preserve"> </w:t>
+      </w:r>
+      <w:r>
+        <w:rPr>
+          <w:rFonts w:hint="default"/>
+          <w:lang w:val="en-US"/>
+        </w:rPr>
+        <w:t>-</w:t>
+      </w:r>
+      <w:r>
+        <w:t xml:space="preserve"> centralizes all configuration values consumed by the frontend, including the base API URL, versioned API slug, and the set of endpoint paths for labels, input size, and inference. This ensures that any change to the backend's address or API structure requires modification in a single location rather than across multiple call sites</w:t>
+      </w:r>
+    </w:p>
+    <w:p>
+      <w:pPr>
+        <w:bidi w:val="0"/>
+        <w:ind w:firstLine="850" w:firstLineChars="0"/>
+        <w:rPr>
+          <w:rFonts w:hint="default"/>
+          <w:lang w:val="en-US"/>
+        </w:rPr>
+      </w:pPr>
+      <w:r>
+        <w:rPr>
+          <w:b/>
+          <w:bCs/>
+        </w:rPr>
+        <w:t>HttpClientWrapperService</w:t>
+      </w:r>
+      <w:r>
+        <w:t xml:space="preserve"> </w:t>
+      </w:r>
+      <w:r>
+        <w:rPr>
+          <w:rFonts w:hint="default"/>
+          <w:lang w:val="en-US"/>
+        </w:rPr>
+        <w:t>-</w:t>
+      </w:r>
+      <w:r>
+        <w:t xml:space="preserve"> provides a typed abstraction layer over Angular's built-in </w:t>
+      </w:r>
+      <w:r>
+        <w:rPr>
+          <w:i/>
+          <w:iCs/>
+        </w:rPr>
+        <w:t>HttpClient</w:t>
+      </w:r>
+      <w:r>
+        <w:t xml:space="preserve">, centralizing </w:t>
+      </w:r>
+      <w:r>
+        <w:rPr>
+          <w:rFonts w:hint="default"/>
+          <w:lang w:val="en-US"/>
+        </w:rPr>
+        <w:t>backend endpoints as convenient functions for consuming services, which don’t need to know about HTTP contract.</w:t>
+      </w:r>
+    </w:p>
+    <w:p>
+      <w:pPr>
+        <w:bidi w:val="0"/>
+        <w:ind w:firstLine="850" w:firstLineChars="0"/>
+      </w:pPr>
+      <w:r>
+        <w:rPr>
+          <w:b/>
+          <w:bCs/>
+        </w:rPr>
+        <w:t>InferenceService</w:t>
+      </w:r>
+      <w:r>
+        <w:t xml:space="preserve"> </w:t>
+      </w:r>
+      <w:r>
+        <w:rPr>
+          <w:rFonts w:hint="default"/>
+          <w:lang w:val="en-US"/>
+        </w:rPr>
+        <w:t>-</w:t>
+      </w:r>
+      <w:r>
+        <w:t xml:space="preserve"> </w:t>
+      </w:r>
+      <w:r>
+        <w:t xml:space="preserve">responsible for dispatching the preprocessed image blob to the backend inference endpoint and returning the raw logit vector to the calling component. The image is transmitted as a binary </w:t>
+      </w:r>
+      <w:r>
+        <w:rPr>
+          <w:i/>
+          <w:iCs/>
+        </w:rPr>
+        <w:t>application/octet-stream</w:t>
+      </w:r>
+      <w:r>
+        <w:t xml:space="preserve"> request body, avoiding the overhead of multipart form encoding and keeping the request as lightweight as possible.</w:t>
+      </w:r>
+    </w:p>
+    <w:p>
+      <w:pPr>
+        <w:bidi w:val="0"/>
+        <w:ind w:firstLine="850" w:firstLineChars="0"/>
+      </w:pPr>
+      <w:r>
+        <w:rPr>
+          <w:b/>
+          <w:bCs/>
+        </w:rPr>
+        <w:t>MetadataService</w:t>
+      </w:r>
+      <w:r>
+        <w:t xml:space="preserve"> </w:t>
+      </w:r>
+      <w:r>
+        <w:rPr>
+          <w:rFonts w:hint="default"/>
+          <w:lang w:val="en-US"/>
+        </w:rPr>
+        <w:t>-</w:t>
+      </w:r>
+      <w:r>
+        <w:t xml:space="preserve"> fetches both the classification label set and the model input size from their respective backend endpoints on first access, caching each response using RxJS</w:t>
+      </w:r>
+      <w:r>
+        <w:rPr>
+          <w:rFonts w:hint="default"/>
+          <w:lang w:val="en-US"/>
+        </w:rPr>
+        <w:t>’s Observable class</w:t>
+      </w:r>
+      <w:r>
+        <w:t xml:space="preserve"> </w:t>
+      </w:r>
+      <w:r>
+        <w:rPr>
+          <w:i/>
+          <w:iCs/>
+        </w:rPr>
+        <w:t>shareReplay(1)</w:t>
+      </w:r>
+      <w:r>
+        <w:rPr>
+          <w:rFonts w:hint="default"/>
+          <w:i/>
+          <w:iCs/>
+          <w:lang w:val="en-US"/>
+        </w:rPr>
+        <w:t xml:space="preserve"> </w:t>
+      </w:r>
+      <w:r>
+        <w:rPr>
+          <w:rFonts w:hint="default"/>
+          <w:i w:val="0"/>
+          <w:iCs w:val="0"/>
+          <w:lang w:val="en-US"/>
+        </w:rPr>
+        <w:t xml:space="preserve">function via </w:t>
+      </w:r>
+      <w:r>
+        <w:rPr>
+          <w:rFonts w:hint="default"/>
+          <w:i/>
+          <w:iCs/>
+          <w:lang w:val="en-US"/>
+        </w:rPr>
+        <w:t>pipe</w:t>
+      </w:r>
+      <w:r>
+        <w:rPr>
+          <w:rFonts w:hint="default"/>
+          <w:i w:val="0"/>
+          <w:iCs w:val="0"/>
+          <w:lang w:val="en-US"/>
+        </w:rPr>
+        <w:t xml:space="preserve"> method</w:t>
+      </w:r>
+      <w:r>
+        <w:t xml:space="preserve"> to ensure that subsequent subscriptions receive the cached value without triggering additional HTTP requests for the lifetime of the application</w:t>
+      </w:r>
+    </w:p>
+    <w:p>
+      <w:pPr>
+        <w:bidi w:val="0"/>
+        <w:ind w:firstLine="850" w:firstLineChars="0"/>
+      </w:pPr>
+      <w:r>
+        <w:rPr>
+          <w:b/>
+          <w:bCs/>
+        </w:rPr>
+        <w:t>MobileObserverService</w:t>
+      </w:r>
+      <w:r>
+        <w:t xml:space="preserve"> </w:t>
+      </w:r>
+      <w:r>
+        <w:rPr>
+          <w:rFonts w:hint="default"/>
+          <w:lang w:val="en-US"/>
+        </w:rPr>
+        <w:t>-</w:t>
+      </w:r>
+      <w:r>
+        <w:t xml:space="preserve"> wraps Angular CDK's </w:t>
+      </w:r>
+      <w:r>
+        <w:rPr>
+          <w:i/>
+          <w:iCs/>
+        </w:rPr>
+        <w:t>BreakpointObserver</w:t>
+      </w:r>
+      <w:r>
+        <w:t xml:space="preserve"> with a breakpoint threshold of 1,100px,</w:t>
+      </w:r>
+      <w:r>
+        <w:rPr>
+          <w:rFonts w:hint="default"/>
+          <w:lang w:val="en-US"/>
+        </w:rPr>
+        <w:t xml:space="preserve"> which was experminetally determined to be a point where desktop layout breaks and switch to mobile is needed,</w:t>
+      </w:r>
+      <w:r>
+        <w:t xml:space="preserve"> exposing an observable that emits whether the current viewport is considered a mobile device, allowing components to adapt their layout accordingly</w:t>
+      </w:r>
+    </w:p>
+    <w:p>
+      <w:pPr>
+        <w:bidi w:val="0"/>
+        <w:ind w:firstLine="850" w:firstLineChars="0"/>
+        <w:rPr>
+          <w:rFonts w:hint="default"/>
+          <w:b/>
+          <w:bCs/>
+          <w:i/>
+          <w:iCs/>
+          <w:lang w:val="en-US"/>
+        </w:rPr>
+      </w:pPr>
+      <w:r>
+        <w:rPr>
+          <w:b/>
+          <w:bCs/>
+          <w:i/>
+          <w:iCs/>
+        </w:rPr>
+        <w:t>User Interface</w:t>
+      </w:r>
+      <w:r>
+        <w:rPr>
+          <w:rFonts w:hint="default"/>
+          <w:b/>
+          <w:bCs/>
+          <w:i/>
+          <w:iCs/>
+          <w:lang w:val="en-US"/>
+        </w:rPr>
+        <w:t>:</w:t>
+      </w:r>
+    </w:p>
+    <w:p>
+      <w:pPr>
+        <w:jc w:val="center"/>
+        <w:rPr>
+          <w:rStyle w:val="19"/>
+          <w:rFonts w:hint="default"/>
+          <w:lang w:val="en-US"/>
+        </w:rPr>
+      </w:pPr>
+      <w:r>
+        <w:drawing>
+          <wp:inline distT="0" distB="0" distL="114300" distR="114300">
+            <wp:extent cx="5757545" cy="3311525"/>
+            <wp:effectExtent l="0" t="0" r="14605" b="3175"/>
+            <wp:docPr id="12" name="Picture 1"/>
+            <wp:cNvGraphicFramePr>
+              <a:graphicFrameLocks xmlns:a="http://schemas.openxmlformats.org/drawingml/2006/main" noChangeAspect="1"/>
+            </wp:cNvGraphicFramePr>
+            <a:graphic xmlns:a="http://schemas.openxmlformats.org/drawingml/2006/main">
+              <a:graphicData uri="http://schemas.openxmlformats.org/drawingml/2006/picture">
+                <pic:pic xmlns:pic="http://schemas.openxmlformats.org/drawingml/2006/picture">
+                  <pic:nvPicPr>
+                    <pic:cNvPr id="12" name="Picture 1"/>
+                    <pic:cNvPicPr>
+                      <a:picLocks noChangeAspect="1"/>
+                    </pic:cNvPicPr>
+                  </pic:nvPicPr>
+                  <pic:blipFill>
+                    <a:blip r:embed="rId21"/>
+                    <a:stretch>
+                      <a:fillRect/>
+                    </a:stretch>
+                  </pic:blipFill>
+                  <pic:spPr>
+                    <a:xfrm>
+                      <a:off x="0" y="0"/>
+                      <a:ext cx="5757545" cy="3311525"/>
+                    </a:xfrm>
+                    <a:prstGeom prst="rect">
+                      <a:avLst/>
+                    </a:prstGeom>
+                    <a:noFill/>
+                    <a:ln>
+                      <a:noFill/>
+                    </a:ln>
+                  </pic:spPr>
+                </pic:pic>
+              </a:graphicData>
+            </a:graphic>
+          </wp:inline>
+        </w:drawing>
+      </w:r>
+      <w:r>
+        <w:br w:type="textWrapping"/>
+      </w:r>
+      <w:r>
+        <w:rPr>
+          <w:rStyle w:val="19"/>
+          <w:rFonts w:hint="default"/>
+          <w:lang w:val="en-US"/>
+        </w:rPr>
+        <w:t>Figure 4.1 - Screenshot of desktop frontend after prediction has been made</w:t>
+      </w:r>
+    </w:p>
+    <w:p>
+      <w:pPr>
+        <w:bidi w:val="0"/>
+        <w:ind w:firstLine="850" w:firstLineChars="0"/>
+        <w:rPr>
+          <w:rFonts w:hint="default"/>
+          <w:b/>
+          <w:bCs/>
+          <w:i/>
+          <w:iCs/>
+          <w:lang w:val="en-US"/>
+        </w:rPr>
+      </w:pPr>
+    </w:p>
+    <w:p>
+      <w:pPr>
+        <w:bidi w:val="0"/>
+        <w:ind w:firstLine="850" w:firstLineChars="0"/>
+        <w:jc w:val="center"/>
+        <w:rPr>
+          <w:rStyle w:val="19"/>
+          <w:rFonts w:hint="default"/>
+          <w:lang w:val="en-US"/>
+          <w:woUserID w:val="0"/>
+        </w:rPr>
+      </w:pPr>
+      <w:r>
+        <w:drawing>
+          <wp:inline distT="0" distB="0" distL="114300" distR="114300">
+            <wp:extent cx="2506980" cy="5820410"/>
+            <wp:effectExtent l="0" t="0" r="7620" b="8890"/>
+            <wp:docPr id="13" name="Picture 2"/>
+            <wp:cNvGraphicFramePr>
+              <a:graphicFrameLocks xmlns:a="http://schemas.openxmlformats.org/drawingml/2006/main" noChangeAspect="1"/>
+            </wp:cNvGraphicFramePr>
+            <a:graphic xmlns:a="http://schemas.openxmlformats.org/drawingml/2006/main">
+              <a:graphicData uri="http://schemas.openxmlformats.org/drawingml/2006/picture">
+                <pic:pic xmlns:pic="http://schemas.openxmlformats.org/drawingml/2006/picture">
+                  <pic:nvPicPr>
+                    <pic:cNvPr id="13" name="Picture 2"/>
+                    <pic:cNvPicPr>
+                      <a:picLocks noChangeAspect="1"/>
+                    </pic:cNvPicPr>
+                  </pic:nvPicPr>
+                  <pic:blipFill>
+                    <a:blip r:embed="rId22"/>
+                    <a:stretch>
+                      <a:fillRect/>
+                    </a:stretch>
+                  </pic:blipFill>
+                  <pic:spPr>
+                    <a:xfrm>
+                      <a:off x="0" y="0"/>
+                      <a:ext cx="2506980" cy="5820410"/>
+                    </a:xfrm>
+                    <a:prstGeom prst="rect">
+                      <a:avLst/>
+                    </a:prstGeom>
+                    <a:noFill/>
+                    <a:ln>
+                      <a:noFill/>
+                    </a:ln>
+                  </pic:spPr>
+                </pic:pic>
+              </a:graphicData>
+            </a:graphic>
+          </wp:inline>
+        </w:drawing>
+      </w:r>
+      <w:r>
+        <w:br w:type="textWrapping"/>
+      </w:r>
+      <w:r>
+        <w:rPr>
+          <w:rStyle w:val="19"/>
+          <w:rFonts w:hint="default"/>
+          <w:lang w:val="en-US"/>
+        </w:rPr>
+        <w:t>Figure 4.2 - Screenshot of desktop frontend after prediction has been made</w:t>
+      </w:r>
+    </w:p>
+    <w:p>
+      <w:pPr>
+        <w:bidi w:val="0"/>
+        <w:ind w:firstLine="850" w:firstLineChars="0"/>
+      </w:pPr>
+      <w:r>
+        <w:t xml:space="preserve">As shown in Fig. </w:t>
+      </w:r>
+      <w:r>
+        <w:rPr>
+          <w:rFonts w:hint="default"/>
+          <w:lang w:val="en-US"/>
+        </w:rPr>
+        <w:t>4.1</w:t>
+      </w:r>
+      <w:r>
+        <w:t xml:space="preserve">, the inference screen presents the user with a two-panel layout. The left panel contains the image upload area </w:t>
+      </w:r>
+      <w:r>
+        <w:rPr>
+          <w:rFonts w:hint="default"/>
+          <w:lang w:val="en-US"/>
+        </w:rPr>
+        <w:t>-</w:t>
+      </w:r>
+      <w:r>
+        <w:t xml:space="preserve"> a dashed dropzone that accepts drag-and-drop or click-to-upload interaction, displaying the accepted file formats to the user. Upon selecting a valid image, the file is rendered onto a canvas element </w:t>
+      </w:r>
+      <w:r>
+        <w:rPr>
+          <w:rFonts w:hint="default"/>
+          <w:lang w:val="en-US"/>
+        </w:rPr>
+        <w:t>and re</w:t>
+      </w:r>
+      <w:r>
+        <w:t>sized to the model's expected input dimensions, giving the user visual confirmation of the submitted image. The right panel contains the results table, headed by Prediction and Confidence columns, which is populated with the top-5 classification candidates and their associated confidence scores once the server returns a response. A status bar at the bottom of the results panel communicates the current state of the application to the user</w:t>
+      </w:r>
+      <w:r>
+        <w:rPr>
+          <w:rFonts w:hint="default"/>
+          <w:lang w:val="en-US"/>
+        </w:rPr>
+        <w:t>,</w:t>
+      </w:r>
+      <w:r>
+        <w:t xml:space="preserve"> displaying a prompt to upload an image in the idle state, a loading indicator during inference, and an error message should the request fail.</w:t>
+      </w:r>
+    </w:p>
+    <w:p>
+      <w:pPr>
+        <w:bidi w:val="0"/>
+        <w:ind w:firstLine="850" w:firstLineChars="0"/>
+        <w:rPr>
+          <w:rFonts w:hint="default"/>
+          <w:lang w:val="en-US"/>
+        </w:rPr>
+      </w:pPr>
+      <w:r>
+        <w:t>The layout is fully responsive, transitioning to a single-column stacked arrangement on viewports narrower than 1,100px, ensuring consistent usability on mobile devices without requiring a separate mobile interface</w:t>
+      </w:r>
+      <w:r>
+        <w:rPr>
+          <w:rFonts w:hint="default"/>
+          <w:lang w:val="en-US"/>
+        </w:rPr>
+        <w:t>, as shown on Fig 4.2.</w:t>
       </w:r>
       <w:r>
         <w:rPr>
@@ -6075,7 +7106,7 @@
       </w:r>
       <w:r>
         <w:rPr>
-          <w:rStyle w:val="12"/>
+          <w:rStyle w:val="13"/>
           <w:rFonts w:hint="default" w:ascii="Times New Roman" w:hAnsi="Times New Roman"/>
           <w:b w:val="0"/>
           <w:bCs w:val="0"/>
@@ -6161,7 +7192,7 @@
       </w:r>
       <w:r>
         <w:rPr>
-          <w:rStyle w:val="12"/>
+          <w:rStyle w:val="13"/>
           <w:rFonts w:hint="default" w:ascii="Times New Roman" w:hAnsi="Times New Roman"/>
           <w:b w:val="0"/>
           <w:bCs w:val="0"/>
@@ -6247,7 +7278,7 @@
       </w:r>
       <w:r>
         <w:rPr>
-          <w:rStyle w:val="12"/>
+          <w:rStyle w:val="13"/>
           <w:rFonts w:hint="default" w:ascii="Times New Roman" w:hAnsi="Times New Roman"/>
           <w:b w:val="0"/>
           <w:bCs w:val="0"/>
@@ -6333,7 +7364,7 @@
       </w:r>
       <w:r>
         <w:rPr>
-          <w:rStyle w:val="12"/>
+          <w:rStyle w:val="13"/>
           <w:rFonts w:hint="default" w:ascii="Times New Roman" w:hAnsi="Times New Roman"/>
           <w:b w:val="0"/>
           <w:bCs w:val="0"/>
@@ -6419,7 +7450,7 @@
       </w:r>
       <w:r>
         <w:rPr>
-          <w:rStyle w:val="12"/>
+          <w:rStyle w:val="13"/>
           <w:rFonts w:hint="default" w:ascii="Times New Roman" w:hAnsi="Times New Roman"/>
           <w:b w:val="0"/>
           <w:bCs w:val="0"/>
@@ -6505,7 +7536,7 @@
       </w:r>
       <w:r>
         <w:rPr>
-          <w:rStyle w:val="12"/>
+          <w:rStyle w:val="13"/>
           <w:rFonts w:hint="default" w:ascii="Times New Roman" w:hAnsi="Times New Roman"/>
           <w:b w:val="0"/>
           <w:bCs w:val="0"/>
@@ -6591,7 +7622,7 @@
       </w:r>
       <w:r>
         <w:rPr>
-          <w:rStyle w:val="12"/>
+          <w:rStyle w:val="13"/>
           <w:rFonts w:hint="default" w:ascii="Times New Roman" w:hAnsi="Times New Roman"/>
           <w:b w:val="0"/>
           <w:bCs w:val="0"/>
@@ -6677,7 +7708,7 @@
       </w:r>
       <w:r>
         <w:rPr>
-          <w:rStyle w:val="12"/>
+          <w:rStyle w:val="13"/>
           <w:rFonts w:hint="default" w:ascii="Times New Roman" w:hAnsi="Times New Roman"/>
           <w:b w:val="0"/>
           <w:bCs w:val="0"/>
@@ -6763,7 +7794,7 @@
       </w:r>
       <w:r>
         <w:rPr>
-          <w:rStyle w:val="12"/>
+          <w:rStyle w:val="13"/>
           <w:rFonts w:hint="default" w:ascii="Times New Roman" w:hAnsi="Times New Roman"/>
           <w:b w:val="0"/>
           <w:bCs w:val="0"/>
@@ -6849,7 +7880,7 @@
       </w:r>
       <w:r>
         <w:rPr>
-          <w:rStyle w:val="12"/>
+          <w:rStyle w:val="13"/>
           <w:rFonts w:hint="default" w:ascii="Times New Roman" w:hAnsi="Times New Roman"/>
           <w:b w:val="0"/>
           <w:bCs w:val="0"/>
@@ -6935,7 +7966,7 @@
       </w:r>
       <w:r>
         <w:rPr>
-          <w:rStyle w:val="12"/>
+          <w:rStyle w:val="13"/>
           <w:rFonts w:hint="default" w:ascii="Times New Roman" w:hAnsi="Times New Roman"/>
           <w:b w:val="0"/>
           <w:bCs w:val="0"/>
@@ -7032,7 +8063,7 @@
       </w:r>
       <w:r>
         <w:rPr>
-          <w:rStyle w:val="12"/>
+          <w:rStyle w:val="13"/>
           <w:rFonts w:hint="default"/>
           <w:b w:val="0"/>
           <w:bCs w:val="0"/>
@@ -7129,7 +8160,7 @@
       </w:r>
       <w:r>
         <w:rPr>
-          <w:rStyle w:val="12"/>
+          <w:rStyle w:val="13"/>
           <w:rFonts w:hint="default"/>
           <w:b w:val="0"/>
           <w:bCs w:val="0"/>
@@ -7226,7 +8257,7 @@
       </w:r>
       <w:r>
         <w:rPr>
-          <w:rStyle w:val="12"/>
+          <w:rStyle w:val="13"/>
           <w:rFonts w:hint="default"/>
           <w:b w:val="0"/>
           <w:bCs w:val="0"/>
@@ -7345,7 +8376,7 @@
       </w:r>
       <w:r>
         <w:rPr>
-          <w:rStyle w:val="12"/>
+          <w:rStyle w:val="13"/>
           <w:rFonts w:hint="default"/>
           <w:b w:val="0"/>
           <w:bCs w:val="0"/>
@@ -7442,7 +8473,7 @@
       </w:r>
       <w:r>
         <w:rPr>
-          <w:rStyle w:val="12"/>
+          <w:rStyle w:val="13"/>
           <w:rFonts w:hint="default"/>
           <w:b w:val="0"/>
           <w:bCs w:val="0"/>
@@ -7539,7 +8570,7 @@
       </w:r>
       <w:r>
         <w:rPr>
-          <w:rStyle w:val="12"/>
+          <w:rStyle w:val="13"/>
           <w:rFonts w:hint="default"/>
           <w:b w:val="0"/>
           <w:bCs w:val="0"/>
@@ -7636,7 +8667,7 @@
       </w:r>
       <w:r>
         <w:rPr>
-          <w:rStyle w:val="12"/>
+          <w:rStyle w:val="13"/>
           <w:rFonts w:hint="default"/>
           <w:b w:val="0"/>
           <w:bCs w:val="0"/>
@@ -7733,7 +8764,7 @@
       </w:r>
       <w:r>
         <w:rPr>
-          <w:rStyle w:val="12"/>
+          <w:rStyle w:val="13"/>
           <w:rFonts w:hint="default"/>
           <w:b w:val="0"/>
           <w:bCs w:val="0"/>
@@ -7830,7 +8861,7 @@
       </w:r>
       <w:r>
         <w:rPr>
-          <w:rStyle w:val="12"/>
+          <w:rStyle w:val="13"/>
           <w:rFonts w:hint="default"/>
           <w:b w:val="0"/>
           <w:bCs w:val="0"/>
@@ -7927,7 +8958,7 @@
       </w:r>
       <w:r>
         <w:rPr>
-          <w:rStyle w:val="12"/>
+          <w:rStyle w:val="13"/>
           <w:rFonts w:hint="default"/>
           <w:b w:val="0"/>
           <w:bCs w:val="0"/>
@@ -8024,7 +9055,7 @@
       </w:r>
       <w:r>
         <w:rPr>
-          <w:rStyle w:val="12"/>
+          <w:rStyle w:val="13"/>
           <w:rFonts w:hint="default"/>
           <w:b w:val="0"/>
           <w:bCs w:val="0"/>
@@ -8105,7 +9136,7 @@
 <w:ftr xmlns:wpc="http://schemas.microsoft.com/office/word/2010/wordprocessingCanvas" xmlns:mc="http://schemas.openxmlformats.org/markup-compatibility/2006" xmlns:o="urn:schemas-microsoft-com:office:office" xmlns:r="http://schemas.openxmlformats.org/officeDocument/2006/relationships" xmlns:m="http://schemas.openxmlformats.org/officeDocument/2006/math" xmlns:v="urn:schemas-microsoft-com:vml" xmlns:wp14="http://schemas.microsoft.com/office/word/2010/wordprocessingDrawing" xmlns:wp="http://schemas.openxmlformats.org/drawingml/2006/wordprocessingDrawing" xmlns:w10="urn:schemas-microsoft-com:office:word" xmlns:w="http://schemas.openxmlformats.org/wordprocessingml/2006/main" xmlns:w14="http://schemas.microsoft.com/office/word/2010/wordml" xmlns:w15="http://schemas.microsoft.com/office/word/2012/wordml" xmlns:wpg="http://schemas.microsoft.com/office/word/2010/wordprocessingGroup" xmlns:wpi="http://schemas.microsoft.com/office/word/2010/wordprocessingInk" xmlns:wne="http://schemas.microsoft.com/office/word/2006/wordml" xmlns:wps="http://schemas.microsoft.com/office/word/2010/wordprocessingShape" xmlns:wpsCustomData="http://www.wps.cn/officeDocument/2013/wpsCustomData" mc:Ignorable="w14 w15 wp14">
   <w:p>
     <w:pPr>
-      <w:pStyle w:val="9"/>
+      <w:pStyle w:val="10"/>
     </w:pPr>
     <w:r>
       <w:rPr>
@@ -8162,7 +9193,7 @@
                       <w:txbxContent>
                         <w:p>
                           <w:pPr>
-                            <w:pStyle w:val="9"/>
+                            <w:pStyle w:val="10"/>
                           </w:pPr>
                           <w:r>
                             <w:fldChar w:fldCharType="begin"/>
@@ -8202,7 +9233,7 @@
                 <w:txbxContent>
                   <w:p>
                     <w:pPr>
-                      <w:pStyle w:val="9"/>
+                      <w:pStyle w:val="10"/>
                     </w:pPr>
                     <w:r>
                       <w:fldChar w:fldCharType="begin"/>
@@ -8315,7 +9346,7 @@
     <w:lsdException w:unhideWhenUsed="0" w:uiPriority="0" w:semiHidden="0" w:name="index 8"/>
     <w:lsdException w:unhideWhenUsed="0" w:uiPriority="0" w:semiHidden="0" w:name="index 9"/>
     <w:lsdException w:qFormat="1" w:unhideWhenUsed="0" w:uiPriority="0" w:semiHidden="0" w:name="toc 1"/>
-    <w:lsdException w:unhideWhenUsed="0" w:uiPriority="0" w:semiHidden="0" w:name="toc 2"/>
+    <w:lsdException w:qFormat="1" w:unhideWhenUsed="0" w:uiPriority="0" w:semiHidden="0" w:name="toc 2"/>
     <w:lsdException w:qFormat="1" w:unhideWhenUsed="0" w:uiPriority="0" w:semiHidden="0" w:name="toc 3"/>
     <w:lsdException w:unhideWhenUsed="0" w:uiPriority="0" w:semiHidden="0" w:name="toc 4"/>
     <w:lsdException w:unhideWhenUsed="0" w:uiPriority="0" w:semiHidden="0" w:name="toc 5"/>
@@ -8563,7 +9594,7 @@
     <w:name w:val="heading 1"/>
     <w:basedOn w:val="3"/>
     <w:next w:val="1"/>
-    <w:link w:val="20"/>
+    <w:link w:val="21"/>
     <w:qFormat/>
     <w:uiPriority w:val="0"/>
     <w:pPr>
@@ -8582,6 +9613,7 @@
     <w:name w:val="heading 2"/>
     <w:basedOn w:val="1"/>
     <w:next w:val="1"/>
+    <w:link w:val="22"/>
     <w:unhideWhenUsed/>
     <w:qFormat/>
     <w:uiPriority w:val="0"/>
@@ -8618,12 +9650,33 @@
       <w:lang w:val="en-US" w:eastAsia="zh-CN" w:bidi="ar"/>
     </w:rPr>
   </w:style>
-  <w:style w:type="character" w:default="1" w:styleId="6">
+  <w:style w:type="paragraph" w:styleId="6">
+    <w:name w:val="heading 4"/>
+    <w:next w:val="1"/>
+    <w:semiHidden/>
+    <w:unhideWhenUsed/>
+    <w:qFormat/>
+    <w:uiPriority w:val="0"/>
+    <w:pPr>
+      <w:spacing w:before="0" w:beforeAutospacing="1" w:after="0" w:afterAutospacing="1"/>
+      <w:jc w:val="left"/>
+    </w:pPr>
+    <w:rPr>
+      <w:rFonts w:hint="eastAsia" w:ascii="SimSun" w:hAnsi="SimSun" w:eastAsia="SimSun" w:cs="SimSun"/>
+      <w:b/>
+      <w:bCs/>
+      <w:kern w:val="0"/>
+      <w:sz w:val="24"/>
+      <w:szCs w:val="24"/>
+      <w:lang w:val="en-US" w:eastAsia="zh-CN" w:bidi="ar"/>
+    </w:rPr>
+  </w:style>
+  <w:style w:type="character" w:default="1" w:styleId="7">
     <w:name w:val="Default Paragraph Font"/>
     <w:qFormat/>
     <w:uiPriority w:val="0"/>
   </w:style>
-  <w:style w:type="table" w:default="1" w:styleId="7">
+  <w:style w:type="table" w:default="1" w:styleId="8">
     <w:name w:val="Normal Table"/>
     <w:semiHidden/>
     <w:uiPriority w:val="0"/>
@@ -8645,9 +9698,9 @@
       <w:szCs w:val="24"/>
     </w:rPr>
   </w:style>
-  <w:style w:type="character" w:styleId="8">
+  <w:style w:type="character" w:styleId="9">
     <w:name w:val="Emphasis"/>
-    <w:basedOn w:val="6"/>
+    <w:basedOn w:val="7"/>
     <w:qFormat/>
     <w:uiPriority w:val="0"/>
     <w:rPr>
@@ -8655,7 +9708,7 @@
       <w:iCs/>
     </w:rPr>
   </w:style>
-  <w:style w:type="paragraph" w:styleId="9">
+  <w:style w:type="paragraph" w:styleId="10">
     <w:name w:val="footer"/>
     <w:basedOn w:val="1"/>
     <w:qFormat/>
@@ -8673,7 +9726,7 @@
       <w:szCs w:val="18"/>
     </w:rPr>
   </w:style>
-  <w:style w:type="paragraph" w:styleId="10">
+  <w:style w:type="paragraph" w:styleId="11">
     <w:name w:val="header"/>
     <w:basedOn w:val="1"/>
     <w:uiPriority w:val="0"/>
@@ -8689,9 +9742,9 @@
       <w:szCs w:val="18"/>
     </w:rPr>
   </w:style>
-  <w:style w:type="character" w:styleId="11">
+  <w:style w:type="character" w:styleId="12">
     <w:name w:val="HTML Code"/>
-    <w:basedOn w:val="6"/>
+    <w:basedOn w:val="7"/>
     <w:uiPriority w:val="0"/>
     <w:rPr>
       <w:rFonts w:ascii="Courier New" w:hAnsi="Courier New" w:cs="Courier New"/>
@@ -8699,9 +9752,9 @@
       <w:szCs w:val="20"/>
     </w:rPr>
   </w:style>
-  <w:style w:type="character" w:styleId="12">
+  <w:style w:type="character" w:styleId="13">
     <w:name w:val="Hyperlink"/>
-    <w:basedOn w:val="6"/>
+    <w:basedOn w:val="7"/>
     <w:qFormat/>
     <w:uiPriority w:val="0"/>
     <w:rPr>
@@ -8709,9 +9762,9 @@
       <w:u w:val="single"/>
     </w:rPr>
   </w:style>
-  <w:style w:type="character" w:styleId="13">
+  <w:style w:type="character" w:styleId="14">
     <w:name w:val="Strong"/>
-    <w:basedOn w:val="6"/>
+    <w:basedOn w:val="7"/>
     <w:qFormat/>
     <w:uiPriority w:val="0"/>
     <w:rPr>
@@ -8719,23 +9772,24 @@
       <w:bCs/>
     </w:rPr>
   </w:style>
-  <w:style w:type="paragraph" w:styleId="14">
+  <w:style w:type="paragraph" w:styleId="15">
     <w:name w:val="toc 1"/>
     <w:basedOn w:val="1"/>
     <w:next w:val="1"/>
     <w:qFormat/>
     <w:uiPriority w:val="0"/>
   </w:style>
-  <w:style w:type="paragraph" w:styleId="15">
+  <w:style w:type="paragraph" w:styleId="16">
     <w:name w:val="toc 2"/>
     <w:basedOn w:val="1"/>
     <w:next w:val="1"/>
+    <w:qFormat/>
     <w:uiPriority w:val="0"/>
     <w:pPr>
       <w:ind w:left="420" w:leftChars="200"/>
     </w:pPr>
   </w:style>
-  <w:style w:type="paragraph" w:styleId="16">
+  <w:style w:type="paragraph" w:styleId="17">
     <w:name w:val="toc 3"/>
     <w:basedOn w:val="1"/>
     <w:next w:val="1"/>
@@ -8745,9 +9799,10 @@
       <w:ind w:left="840" w:leftChars="400"/>
     </w:pPr>
   </w:style>
-  <w:style w:type="paragraph" w:customStyle="1" w:styleId="17">
+  <w:style w:type="paragraph" w:customStyle="1" w:styleId="18">
     <w:name w:val="WPSOffice手动目录 1"/>
-    <w:link w:val="19"/>
+    <w:link w:val="20"/>
+    <w:qFormat/>
     <w:uiPriority w:val="0"/>
     <w:pPr>
       <w:ind w:leftChars="0"/>
@@ -8758,9 +9813,10 @@
       <w:szCs w:val="20"/>
     </w:rPr>
   </w:style>
-  <w:style w:type="character" w:customStyle="1" w:styleId="18">
+  <w:style w:type="character" w:customStyle="1" w:styleId="19">
     <w:name w:val="Footnote"/>
-    <w:basedOn w:val="6"/>
+    <w:basedOn w:val="7"/>
+    <w:qFormat/>
     <w:uiPriority w:val="0"/>
     <w:rPr>
       <w:rFonts w:ascii="Times New Roman" w:hAnsi="Times New Roman" w:cs="Times New Roman" w:eastAsiaTheme="minorEastAsia"/>
@@ -8768,16 +9824,17 @@
       <w:lang w:val="en-US" w:eastAsia="zh-CN" w:bidi="ar-SA"/>
     </w:rPr>
   </w:style>
-  <w:style w:type="character" w:customStyle="1" w:styleId="19">
+  <w:style w:type="character" w:customStyle="1" w:styleId="20">
     <w:name w:val="WPSOffice手动目录 1 Char"/>
-    <w:link w:val="17"/>
+    <w:link w:val="18"/>
+    <w:qFormat/>
     <w:uiPriority w:val="0"/>
     <w:rPr>
       <w:sz w:val="20"/>
       <w:szCs w:val="20"/>
     </w:rPr>
   </w:style>
-  <w:style w:type="character" w:customStyle="1" w:styleId="20">
+  <w:style w:type="character" w:customStyle="1" w:styleId="21">
     <w:name w:val="Heading 1 Char"/>
     <w:link w:val="2"/>
     <w:qFormat/>
@@ -8787,6 +9844,17 @@
       <w:bCs/>
       <w:sz w:val="28"/>
       <w:szCs w:val="28"/>
+    </w:rPr>
+  </w:style>
+  <w:style w:type="character" w:customStyle="1" w:styleId="22">
+    <w:name w:val="Heading 2 Char"/>
+    <w:link w:val="4"/>
+    <w:uiPriority w:val="0"/>
+    <w:rPr>
+      <w:b/>
+      <w:bCs/>
+      <w:sz w:val="28"/>
+      <w:szCs w:val="26"/>
     </w:rPr>
   </w:style>
 </w:styles>

</xml_diff>